<commit_message>
docs(guía cliente): sección 5, línea definitiva +57 310 5639334 (cambio tras OK del cliente)
</commit_message>
<xml_diff>
--- a/docs/Guia_Metodos_de_Pago_DePaseoEnFincas.docx
+++ b/docs/Guia_Metodos_de_Pago_DePaseoEnFincas.docx
@@ -732,7 +732,7 @@
                 <w:sz w:val="20"/>
                 <w:szCs w:val="20"/>
               </w:rPr>
-              <w:t xml:space="preserve">La línea +1 201-701-8810 con la que el asistente atiende a los clientes</w:t>
+              <w:t xml:space="preserve">La línea con la que el asistente atiende a los clientes: hoy +1 201-701-8810, que pasará a +57 310 5639334 (sección 5)</w:t>
             </w:r>
           </w:p>
         </w:tc>
@@ -2292,7 +2292,7 @@
           <w:sz w:val="20"/>
           <w:szCs w:val="20"/>
         </w:rPr>
-        <w:t xml:space="preserve">Al día siguiente, escriba "hola" a la línea +1 201-701-8810 y confirme que el asistente responde.</w:t>
+        <w:t xml:space="preserve">Al día siguiente, escriba "hola" a la línea del asistente (hoy +1 201-701-8810) y confirme que responde.</w:t>
       </w:r>
     </w:p>
     <w:p>
@@ -3460,6 +3460,372 @@
       </w:tr>
     </w:tbl>
     <w:p>
+      <w:r>
+        <w:br w:type="page"/>
+      </w:r>
+    </w:p>
+    <w:p>
+      <w:pPr>
+        <w:pStyle w:val="Heading1"/>
+      </w:pPr>
+      <w:r>
+        <w:t xml:space="preserve">5. Cambio de la línea de WhatsApp del asistente</w:t>
+      </w:r>
+    </w:p>
+    <w:tbl>
+      <w:tblPr>
+        <w:tblW w:type="dxa" w:w="9360"/>
+        <w:tblBorders>
+          <w:top w:val="single" w:color="auto" w:sz="4"/>
+          <w:left w:val="single" w:color="auto" w:sz="4"/>
+          <w:bottom w:val="single" w:color="auto" w:sz="4"/>
+          <w:right w:val="single" w:color="auto" w:sz="4"/>
+          <w:insideH w:val="single" w:color="auto" w:sz="4"/>
+          <w:insideV w:val="single" w:color="auto" w:sz="4"/>
+        </w:tblBorders>
+      </w:tblPr>
+      <w:tblGrid>
+        <w:gridCol w:w="9360"/>
+      </w:tblGrid>
+      <w:tr>
+        <w:tc>
+          <w:tcPr>
+            <w:tcW w:type="dxa" w:w="9360"/>
+            <w:tcBorders>
+              <w:top w:val="single" w:color="1565C0" w:sz="3"/>
+              <w:left w:val="single" w:color="E0E0E0" w:sz="1"/>
+              <w:bottom w:val="single" w:color="E0E0E0" w:sz="1"/>
+              <w:right w:val="single" w:color="E0E0E0" w:sz="1"/>
+            </w:tcBorders>
+            <w:shd w:fill="E8F5E9" w:val="clear"/>
+            <w:tcMar>
+              <w:top w:type="dxa" w:w="120"/>
+              <w:left w:type="dxa" w:w="160"/>
+              <w:bottom w:type="dxa" w:w="120"/>
+              <w:right w:type="dxa" w:w="160"/>
+            </w:tcMar>
+          </w:tcPr>
+          <w:p>
+            <w:r>
+              <w:rPr>
+                <w:rFonts w:ascii="Arial" w:cs="Arial" w:eastAsia="Arial" w:hAnsi="Arial"/>
+                <w:b/>
+                <w:bCs/>
+                <w:color w:val="1565C0"/>
+                <w:sz w:val="22"/>
+                <w:szCs w:val="22"/>
+              </w:rPr>
+              <w:t xml:space="preserve">📱 Número confirmado</w:t>
+            </w:r>
+          </w:p>
+          <w:p>
+            <w:pPr>
+              <w:spacing w:before="60"/>
+            </w:pPr>
+            <w:r>
+              <w:rPr>
+                <w:rFonts w:ascii="Arial" w:cs="Arial" w:eastAsia="Arial" w:hAnsi="Arial"/>
+                <w:color w:val="212121"/>
+                <w:sz w:val="20"/>
+                <w:szCs w:val="20"/>
+              </w:rPr>
+              <w:t xml:space="preserve">El asistente pasará a atender a los clientes desde la línea colombiana de De Paseo en Fincas: +57 310 5639334. Hoy atiende desde +1 201-701-8810. Ambas líneas están en la misma cuenta de WhatsApp Business (De Paseo En Fincas raaamp), así que el método de pago de Meta de la sección 3.1 cubre las dos.</w:t>
+            </w:r>
+          </w:p>
+        </w:tc>
+      </w:tr>
+    </w:tbl>
+    <w:p>
+      <w:pPr>
+        <w:spacing w:after="0" w:before="100"/>
+      </w:pPr>
+    </w:p>
+    <w:tbl>
+      <w:tblPr>
+        <w:tblW w:type="dxa" w:w="9360"/>
+        <w:tblBorders>
+          <w:top w:val="single" w:color="auto" w:sz="4"/>
+          <w:left w:val="single" w:color="auto" w:sz="4"/>
+          <w:bottom w:val="single" w:color="auto" w:sz="4"/>
+          <w:right w:val="single" w:color="auto" w:sz="4"/>
+          <w:insideH w:val="single" w:color="auto" w:sz="4"/>
+          <w:insideV w:val="single" w:color="auto" w:sz="4"/>
+        </w:tblBorders>
+      </w:tblPr>
+      <w:tblGrid>
+        <w:gridCol w:w="2200"/>
+        <w:gridCol w:w="3000"/>
+        <w:gridCol w:w="4160"/>
+      </w:tblGrid>
+      <w:tr>
+        <w:tc>
+          <w:tcPr>
+            <w:tcW w:type="dxa" w:w="2200"/>
+            <w:tcBorders>
+              <w:top w:val="single" w:color="E0E0E0" w:sz="1"/>
+              <w:left w:val="single" w:color="E0E0E0" w:sz="1"/>
+              <w:bottom w:val="single" w:color="E0E0E0" w:sz="1"/>
+              <w:right w:val="single" w:color="E0E0E0" w:sz="1"/>
+            </w:tcBorders>
+            <w:shd w:fill="2E7D32" w:val="clear"/>
+            <w:tcMar>
+              <w:top w:type="dxa" w:w="80"/>
+              <w:left w:type="dxa" w:w="120"/>
+              <w:bottom w:type="dxa" w:w="80"/>
+              <w:right w:type="dxa" w:w="120"/>
+            </w:tcMar>
+          </w:tcPr>
+          <w:p>
+            <w:r>
+              <w:rPr>
+                <w:rFonts w:ascii="Arial" w:cs="Arial" w:eastAsia="Arial" w:hAnsi="Arial"/>
+                <w:b/>
+                <w:bCs/>
+                <w:color w:val="FFFFFF"/>
+                <w:sz w:val="20"/>
+                <w:szCs w:val="20"/>
+              </w:rPr>
+              <w:t xml:space="preserve">Línea</w:t>
+            </w:r>
+          </w:p>
+        </w:tc>
+        <w:tc>
+          <w:tcPr>
+            <w:tcW w:type="dxa" w:w="3000"/>
+            <w:tcBorders>
+              <w:top w:val="single" w:color="E0E0E0" w:sz="1"/>
+              <w:left w:val="single" w:color="E0E0E0" w:sz="1"/>
+              <w:bottom w:val="single" w:color="E0E0E0" w:sz="1"/>
+              <w:right w:val="single" w:color="E0E0E0" w:sz="1"/>
+            </w:tcBorders>
+            <w:shd w:fill="2E7D32" w:val="clear"/>
+            <w:tcMar>
+              <w:top w:type="dxa" w:w="80"/>
+              <w:left w:type="dxa" w:w="120"/>
+              <w:bottom w:type="dxa" w:w="80"/>
+              <w:right w:type="dxa" w:w="120"/>
+            </w:tcMar>
+          </w:tcPr>
+          <w:p>
+            <w:r>
+              <w:rPr>
+                <w:rFonts w:ascii="Arial" w:cs="Arial" w:eastAsia="Arial" w:hAnsi="Arial"/>
+                <w:b/>
+                <w:bCs/>
+                <w:color w:val="FFFFFF"/>
+                <w:sz w:val="20"/>
+                <w:szCs w:val="20"/>
+              </w:rPr>
+              <w:t xml:space="preserve">Estado</w:t>
+            </w:r>
+          </w:p>
+        </w:tc>
+        <w:tc>
+          <w:tcPr>
+            <w:tcW w:type="dxa" w:w="4160"/>
+            <w:tcBorders>
+              <w:top w:val="single" w:color="E0E0E0" w:sz="1"/>
+              <w:left w:val="single" w:color="E0E0E0" w:sz="1"/>
+              <w:bottom w:val="single" w:color="E0E0E0" w:sz="1"/>
+              <w:right w:val="single" w:color="E0E0E0" w:sz="1"/>
+            </w:tcBorders>
+            <w:shd w:fill="2E7D32" w:val="clear"/>
+            <w:tcMar>
+              <w:top w:type="dxa" w:w="80"/>
+              <w:left w:type="dxa" w:w="120"/>
+              <w:bottom w:type="dxa" w:w="80"/>
+              <w:right w:type="dxa" w:w="120"/>
+            </w:tcMar>
+          </w:tcPr>
+          <w:p>
+            <w:r>
+              <w:rPr>
+                <w:rFonts w:ascii="Arial" w:cs="Arial" w:eastAsia="Arial" w:hAnsi="Arial"/>
+                <w:b/>
+                <w:bCs/>
+                <w:color w:val="FFFFFF"/>
+                <w:sz w:val="20"/>
+                <w:szCs w:val="20"/>
+              </w:rPr>
+              <w:t xml:space="preserve">Uso</w:t>
+            </w:r>
+          </w:p>
+        </w:tc>
+      </w:tr>
+      <w:tr>
+        <w:tc>
+          <w:tcPr>
+            <w:tcW w:type="dxa" w:w="2200"/>
+            <w:tcBorders>
+              <w:top w:val="single" w:color="E0E0E0" w:sz="1"/>
+              <w:left w:val="single" w:color="E0E0E0" w:sz="1"/>
+              <w:bottom w:val="single" w:color="E0E0E0" w:sz="1"/>
+              <w:right w:val="single" w:color="E0E0E0" w:sz="1"/>
+            </w:tcBorders>
+            <w:tcMar>
+              <w:top w:type="dxa" w:w="80"/>
+              <w:left w:type="dxa" w:w="120"/>
+              <w:bottom w:type="dxa" w:w="80"/>
+              <w:right w:type="dxa" w:w="120"/>
+            </w:tcMar>
+          </w:tcPr>
+          <w:p>
+            <w:r>
+              <w:rPr>
+                <w:rFonts w:ascii="Arial" w:cs="Arial" w:eastAsia="Arial" w:hAnsi="Arial"/>
+                <w:color w:val="212121"/>
+                <w:sz w:val="20"/>
+                <w:szCs w:val="20"/>
+              </w:rPr>
+              <w:t xml:space="preserve">+1 201-701-8810</w:t>
+            </w:r>
+          </w:p>
+        </w:tc>
+        <w:tc>
+          <w:tcPr>
+            <w:tcW w:type="dxa" w:w="3000"/>
+            <w:tcBorders>
+              <w:top w:val="single" w:color="E0E0E0" w:sz="1"/>
+              <w:left w:val="single" w:color="E0E0E0" w:sz="1"/>
+              <w:bottom w:val="single" w:color="E0E0E0" w:sz="1"/>
+              <w:right w:val="single" w:color="E0E0E0" w:sz="1"/>
+            </w:tcBorders>
+            <w:tcMar>
+              <w:top w:type="dxa" w:w="80"/>
+              <w:left w:type="dxa" w:w="120"/>
+              <w:bottom w:type="dxa" w:w="80"/>
+              <w:right w:type="dxa" w:w="120"/>
+            </w:tcMar>
+          </w:tcPr>
+          <w:p>
+            <w:r>
+              <w:rPr>
+                <w:rFonts w:ascii="Arial" w:cs="Arial" w:eastAsia="Arial" w:hAnsi="Arial"/>
+                <w:color w:val="212121"/>
+                <w:sz w:val="20"/>
+                <w:szCs w:val="20"/>
+              </w:rPr>
+              <w:t xml:space="preserve">Operando hoy</w:t>
+            </w:r>
+          </w:p>
+        </w:tc>
+        <w:tc>
+          <w:tcPr>
+            <w:tcW w:type="dxa" w:w="4160"/>
+            <w:tcBorders>
+              <w:top w:val="single" w:color="E0E0E0" w:sz="1"/>
+              <w:left w:val="single" w:color="E0E0E0" w:sz="1"/>
+              <w:bottom w:val="single" w:color="E0E0E0" w:sz="1"/>
+              <w:right w:val="single" w:color="E0E0E0" w:sz="1"/>
+            </w:tcBorders>
+            <w:tcMar>
+              <w:top w:type="dxa" w:w="80"/>
+              <w:left w:type="dxa" w:w="120"/>
+              <w:bottom w:type="dxa" w:w="80"/>
+              <w:right w:type="dxa" w:w="120"/>
+            </w:tcMar>
+          </w:tcPr>
+          <w:p>
+            <w:r>
+              <w:rPr>
+                <w:rFonts w:ascii="Arial" w:cs="Arial" w:eastAsia="Arial" w:hAnsi="Arial"/>
+                <w:color w:val="212121"/>
+                <w:sz w:val="20"/>
+                <w:szCs w:val="20"/>
+              </w:rPr>
+              <w:t xml:space="preserve">Línea con la que el asistente atiende mientras se hace el cambio</w:t>
+            </w:r>
+          </w:p>
+        </w:tc>
+      </w:tr>
+      <w:tr>
+        <w:tc>
+          <w:tcPr>
+            <w:tcW w:type="dxa" w:w="2200"/>
+            <w:tcBorders>
+              <w:top w:val="single" w:color="E0E0E0" w:sz="1"/>
+              <w:left w:val="single" w:color="E0E0E0" w:sz="1"/>
+              <w:bottom w:val="single" w:color="E0E0E0" w:sz="1"/>
+              <w:right w:val="single" w:color="E0E0E0" w:sz="1"/>
+            </w:tcBorders>
+            <w:tcMar>
+              <w:top w:type="dxa" w:w="80"/>
+              <w:left w:type="dxa" w:w="120"/>
+              <w:bottom w:type="dxa" w:w="80"/>
+              <w:right w:type="dxa" w:w="120"/>
+            </w:tcMar>
+          </w:tcPr>
+          <w:p>
+            <w:r>
+              <w:rPr>
+                <w:rFonts w:ascii="Arial" w:cs="Arial" w:eastAsia="Arial" w:hAnsi="Arial"/>
+                <w:color w:val="212121"/>
+                <w:sz w:val="20"/>
+                <w:szCs w:val="20"/>
+              </w:rPr>
+              <w:t xml:space="preserve">+57 310 5639334</w:t>
+            </w:r>
+          </w:p>
+        </w:tc>
+        <w:tc>
+          <w:tcPr>
+            <w:tcW w:type="dxa" w:w="3000"/>
+            <w:tcBorders>
+              <w:top w:val="single" w:color="E0E0E0" w:sz="1"/>
+              <w:left w:val="single" w:color="E0E0E0" w:sz="1"/>
+              <w:bottom w:val="single" w:color="E0E0E0" w:sz="1"/>
+              <w:right w:val="single" w:color="E0E0E0" w:sz="1"/>
+            </w:tcBorders>
+            <w:tcMar>
+              <w:top w:type="dxa" w:w="80"/>
+              <w:left w:type="dxa" w:w="120"/>
+              <w:bottom w:type="dxa" w:w="80"/>
+              <w:right w:type="dxa" w:w="120"/>
+            </w:tcMar>
+          </w:tcPr>
+          <w:p>
+            <w:r>
+              <w:rPr>
+                <w:rFonts w:ascii="Arial" w:cs="Arial" w:eastAsia="Arial" w:hAnsi="Arial"/>
+                <w:color w:val="212121"/>
+                <w:sz w:val="20"/>
+                <w:szCs w:val="20"/>
+              </w:rPr>
+              <w:t xml:space="preserve">Confirmada como línea definitiva</w:t>
+            </w:r>
+          </w:p>
+        </w:tc>
+        <w:tc>
+          <w:tcPr>
+            <w:tcW w:type="dxa" w:w="4160"/>
+            <w:tcBorders>
+              <w:top w:val="single" w:color="E0E0E0" w:sz="1"/>
+              <w:left w:val="single" w:color="E0E0E0" w:sz="1"/>
+              <w:bottom w:val="single" w:color="E0E0E0" w:sz="1"/>
+              <w:right w:val="single" w:color="E0E0E0" w:sz="1"/>
+            </w:tcBorders>
+            <w:tcMar>
+              <w:top w:type="dxa" w:w="80"/>
+              <w:left w:type="dxa" w:w="120"/>
+              <w:bottom w:type="dxa" w:w="80"/>
+              <w:right w:type="dxa" w:w="120"/>
+            </w:tcMar>
+          </w:tcPr>
+          <w:p>
+            <w:r>
+              <w:rPr>
+                <w:rFonts w:ascii="Arial" w:cs="Arial" w:eastAsia="Arial" w:hAnsi="Arial"/>
+                <w:color w:val="212121"/>
+                <w:sz w:val="20"/>
+                <w:szCs w:val="20"/>
+              </w:rPr>
+              <w:t xml:space="preserve">Línea desde la que atenderá el asistente una vez De Paseo en Fincas dé el OK</w:t>
+            </w:r>
+          </w:p>
+        </w:tc>
+      </w:tr>
+    </w:tbl>
+    <w:p>
       <w:pPr>
         <w:spacing w:after="0" w:before="120"/>
       </w:pPr>
@@ -3469,7 +3835,7 @@
         <w:pStyle w:val="Heading2"/>
       </w:pPr>
       <w:r>
-        <w:t xml:space="preserve">Lista de verificación</w:t>
+        <w:t xml:space="preserve">Cómo se hace el cambio</w:t>
       </w:r>
     </w:p>
     <w:p>
@@ -3488,7 +3854,7 @@
           <w:sz w:val="20"/>
           <w:szCs w:val="20"/>
         </w:rPr>
-        <w:t xml:space="preserve">Tarjeta agregada en Meta y alerta amarilla desaparecida.</w:t>
+        <w:t xml:space="preserve">De Paseo en Fincas confirma por escrito a raaamp el OK para hacer el cambio y la fecha en que quiere que ocurra.</w:t>
       </w:r>
     </w:p>
     <w:p>
@@ -3507,7 +3873,7 @@
           <w:sz w:val="20"/>
           <w:szCs w:val="20"/>
         </w:rPr>
-        <w:t xml:space="preserve">Cuenta de facturación de Google Cloud creada y vinculada al proyecto 193383790061; la clave muestra "Pago por uso".</w:t>
+        <w:t xml:space="preserve">raaamp conecta el asistente a la línea +57 310 5639334, revisa las plantillas de mensajes y hace las pruebas completas. El cambio toma unas horas y no requiere nada del lado de De Paseo en Fincas.</w:t>
       </w:r>
     </w:p>
     <w:p>
@@ -3526,7 +3892,7 @@
           <w:sz w:val="20"/>
           <w:szCs w:val="20"/>
         </w:rPr>
-        <w:t xml:space="preserve">Saldo cargado en OpenAI con recarga automática.</w:t>
+        <w:t xml:space="preserve">raaamp confirma por escrito que el asistente ya responde desde +57 310 5639334.</w:t>
       </w:r>
     </w:p>
     <w:p>
@@ -3545,7 +3911,39 @@
           <w:sz w:val="20"/>
           <w:szCs w:val="20"/>
         </w:rPr>
-        <w:t xml:space="preserve">Cuenta de Hetzner creada con tarjeta y correo enviado a raaamp.</w:t>
+        <w:t xml:space="preserve">A partir de ese momento De Paseo en Fincas publica el número +57 310 5639334 en su página, redes e Instagram como línea de atención. La línea +1 201-701-8810 se mantiene respondiendo unas semanas más para los clientes que la tengan guardada, y luego se retira.</w:t>
+      </w:r>
+    </w:p>
+    <w:p>
+      <w:pPr>
+        <w:spacing w:after="0" w:before="80"/>
+      </w:pPr>
+    </w:p>
+    <w:p>
+      <w:pPr>
+        <w:spacing w:after="120" w:before="0"/>
+      </w:pPr>
+      <w:r>
+        <w:rPr>
+          <w:rFonts w:ascii="Arial" w:cs="Arial" w:eastAsia="Arial" w:hAnsi="Arial"/>
+          <w:color w:val="616161"/>
+          <w:sz w:val="20"/>
+          <w:szCs w:val="20"/>
+        </w:rPr>
+        <w:t xml:space="preserve">Importante: la línea +57 310 5639334 quedará dedicada al asistente en la plataforma de WhatsApp Business; no debe usarse al mismo tiempo en la aplicación WhatsApp de un celular.</w:t>
+      </w:r>
+    </w:p>
+    <w:p>
+      <w:pPr>
+        <w:spacing w:after="0" w:before="120"/>
+      </w:pPr>
+    </w:p>
+    <w:p>
+      <w:pPr>
+        <w:pStyle w:val="Heading2"/>
+      </w:pPr>
+      <w:r>
+        <w:t xml:space="preserve">Lista de verificación</w:t>
       </w:r>
     </w:p>
     <w:p>
@@ -3553,7 +3951,7 @@
         <w:pStyle w:val="ListParagraph"/>
         <w:numPr>
           <w:ilvl w:val="0"/>
-          <w:numId w:val="6"/>
+          <w:numId w:val="7"/>
         </w:numPr>
         <w:spacing w:after="60"/>
       </w:pPr>
@@ -3564,7 +3962,7 @@
           <w:sz w:val="20"/>
           <w:szCs w:val="20"/>
         </w:rPr>
-        <w:t xml:space="preserve">Verificación en dos pasos activa en la cuenta de Google.</w:t>
+        <w:t xml:space="preserve">Tarjeta agregada en Meta y alerta amarilla desaparecida.</w:t>
       </w:r>
     </w:p>
     <w:p>
@@ -3572,7 +3970,102 @@
         <w:pStyle w:val="ListParagraph"/>
         <w:numPr>
           <w:ilvl w:val="0"/>
-          <w:numId w:val="6"/>
+          <w:numId w:val="7"/>
+        </w:numPr>
+        <w:spacing w:after="60"/>
+      </w:pPr>
+      <w:r>
+        <w:rPr>
+          <w:rFonts w:ascii="Arial" w:cs="Arial" w:eastAsia="Arial" w:hAnsi="Arial"/>
+          <w:color w:val="212121"/>
+          <w:sz w:val="20"/>
+          <w:szCs w:val="20"/>
+        </w:rPr>
+        <w:t xml:space="preserve">Cuenta de facturación de Google Cloud creada y vinculada al proyecto 193383790061; la clave muestra "Pago por uso".</w:t>
+      </w:r>
+    </w:p>
+    <w:p>
+      <w:pPr>
+        <w:pStyle w:val="ListParagraph"/>
+        <w:numPr>
+          <w:ilvl w:val="0"/>
+          <w:numId w:val="7"/>
+        </w:numPr>
+        <w:spacing w:after="60"/>
+      </w:pPr>
+      <w:r>
+        <w:rPr>
+          <w:rFonts w:ascii="Arial" w:cs="Arial" w:eastAsia="Arial" w:hAnsi="Arial"/>
+          <w:color w:val="212121"/>
+          <w:sz w:val="20"/>
+          <w:szCs w:val="20"/>
+        </w:rPr>
+        <w:t xml:space="preserve">Saldo cargado en OpenAI con recarga automática.</w:t>
+      </w:r>
+    </w:p>
+    <w:p>
+      <w:pPr>
+        <w:pStyle w:val="ListParagraph"/>
+        <w:numPr>
+          <w:ilvl w:val="0"/>
+          <w:numId w:val="7"/>
+        </w:numPr>
+        <w:spacing w:after="60"/>
+      </w:pPr>
+      <w:r>
+        <w:rPr>
+          <w:rFonts w:ascii="Arial" w:cs="Arial" w:eastAsia="Arial" w:hAnsi="Arial"/>
+          <w:color w:val="212121"/>
+          <w:sz w:val="20"/>
+          <w:szCs w:val="20"/>
+        </w:rPr>
+        <w:t xml:space="preserve">Cuenta de Hetzner creada con tarjeta y correo enviado a raaamp.</w:t>
+      </w:r>
+    </w:p>
+    <w:p>
+      <w:pPr>
+        <w:pStyle w:val="ListParagraph"/>
+        <w:numPr>
+          <w:ilvl w:val="0"/>
+          <w:numId w:val="7"/>
+        </w:numPr>
+        <w:spacing w:after="60"/>
+      </w:pPr>
+      <w:r>
+        <w:rPr>
+          <w:rFonts w:ascii="Arial" w:cs="Arial" w:eastAsia="Arial" w:hAnsi="Arial"/>
+          <w:color w:val="212121"/>
+          <w:sz w:val="20"/>
+          <w:szCs w:val="20"/>
+        </w:rPr>
+        <w:t xml:space="preserve">Verificación en dos pasos activa en la cuenta de Google.</w:t>
+      </w:r>
+    </w:p>
+    <w:p>
+      <w:pPr>
+        <w:pStyle w:val="ListParagraph"/>
+        <w:numPr>
+          <w:ilvl w:val="0"/>
+          <w:numId w:val="7"/>
+        </w:numPr>
+        <w:spacing w:after="60"/>
+      </w:pPr>
+      <w:r>
+        <w:rPr>
+          <w:rFonts w:ascii="Arial" w:cs="Arial" w:eastAsia="Arial" w:hAnsi="Arial"/>
+          <w:color w:val="212121"/>
+          <w:sz w:val="20"/>
+          <w:szCs w:val="20"/>
+        </w:rPr>
+        <w:t xml:space="preserve">OK por escrito a raaamp para pasar el asistente a la línea +57 310 5639334.</w:t>
+      </w:r>
+    </w:p>
+    <w:p>
+      <w:pPr>
+        <w:pStyle w:val="ListParagraph"/>
+        <w:numPr>
+          <w:ilvl w:val="0"/>
+          <w:numId w:val="7"/>
         </w:numPr>
         <w:spacing w:after="60"/>
       </w:pPr>
@@ -4013,6 +4506,12 @@
     </w:lvlOverride>
   </w:num>
   <w:num w:numId="6">
+    <w:abstractNumId w:val="8"/>
+    <w:lvlOverride w:ilvl="0">
+      <w:startOverride w:val="1"/>
+    </w:lvlOverride>
+  </w:num>
+  <w:num w:numId="7">
     <w:abstractNumId w:val="2"/>
     <w:lvlOverride w:ilvl="0">
       <w:startOverride w:val="1"/>

</xml_diff>

<commit_message>
docs(guía cliente): credenciales desde variables de entorno (repo en blanco); Hetzner con cuenta existente
</commit_message>
<xml_diff>
--- a/docs/Guia_Metodos_de_Pago_DePaseoEnFincas.docx
+++ b/docs/Guia_Metodos_de_Pago_DePaseoEnFincas.docx
@@ -163,7 +163,7 @@
           <w:sz w:val="20"/>
           <w:szCs w:val="20"/>
         </w:rPr>
-        <w:t xml:space="preserve">Documento CONFIDENCIAL: la primera página contiene la contraseña de la cuenta. No reenviar.</w:t>
+        <w:t xml:space="preserve">Documento CONFIDENCIAL: contiene contraseñas (secciones 1 y 3.4). No reenviar.</w:t>
       </w:r>
     </w:p>
     <w:p>
@@ -271,6 +271,8 @@
             <w:r>
               <w:rPr>
                 <w:rFonts w:ascii="Arial" w:cs="Arial" w:eastAsia="Arial" w:hAnsi="Arial"/>
+                <w:b/>
+                <w:bCs/>
                 <w:color w:val="212121"/>
                 <w:sz w:val="20"/>
                 <w:szCs w:val="20"/>
@@ -332,6 +334,8 @@
             <w:r>
               <w:rPr>
                 <w:rFonts w:ascii="Arial" w:cs="Arial" w:eastAsia="Arial" w:hAnsi="Arial"/>
+                <w:b/>
+                <w:bCs/>
                 <w:color w:val="212121"/>
                 <w:sz w:val="20"/>
                 <w:szCs w:val="20"/>
@@ -2865,9 +2869,157 @@
           <w:sz w:val="22"/>
           <w:szCs w:val="22"/>
         </w:rPr>
-        <w:t xml:space="preserve">El servidor donde corren n8n y Chatwoot está hoy en la cuenta de raaamp. Para que la factura mensual llegue a De Paseo en Fincas:</w:t>
-      </w:r>
-    </w:p>
+        <w:t xml:space="preserve">El servidor donde corren n8n y Chatwoot está hoy en la cuenta de raaamp. De Paseo en Fincas ya tiene su cuenta en Hetzner; falta agregarle la tarjeta para que el servidor pase a esa cuenta y la factura mensual llegue a la empresa.</w:t>
+      </w:r>
+    </w:p>
+    <w:p>
+      <w:pPr>
+        <w:spacing w:after="0" w:before="80"/>
+      </w:pPr>
+    </w:p>
+    <w:tbl>
+      <w:tblPr>
+        <w:tblW w:type="dxa" w:w="9360"/>
+        <w:tblBorders>
+          <w:top w:val="single" w:color="auto" w:sz="4"/>
+          <w:left w:val="single" w:color="auto" w:sz="4"/>
+          <w:bottom w:val="single" w:color="auto" w:sz="4"/>
+          <w:right w:val="single" w:color="auto" w:sz="4"/>
+          <w:insideH w:val="single" w:color="auto" w:sz="4"/>
+          <w:insideV w:val="single" w:color="auto" w:sz="4"/>
+        </w:tblBorders>
+      </w:tblPr>
+      <w:tblGrid>
+        <w:gridCol w:w="3000"/>
+        <w:gridCol w:w="6360"/>
+      </w:tblGrid>
+      <w:tr>
+        <w:tc>
+          <w:tcPr>
+            <w:tcW w:type="dxa" w:w="3000"/>
+            <w:tcBorders>
+              <w:top w:val="single" w:color="E0E0E0" w:sz="1"/>
+              <w:left w:val="single" w:color="E0E0E0" w:sz="1"/>
+              <w:bottom w:val="single" w:color="E0E0E0" w:sz="1"/>
+              <w:right w:val="single" w:color="E0E0E0" w:sz="1"/>
+            </w:tcBorders>
+            <w:shd w:fill="FFF3E0" w:val="clear"/>
+            <w:tcMar>
+              <w:top w:type="dxa" w:w="80"/>
+              <w:left w:type="dxa" w:w="120"/>
+              <w:bottom w:type="dxa" w:w="80"/>
+              <w:right w:type="dxa" w:w="120"/>
+            </w:tcMar>
+          </w:tcPr>
+          <w:p>
+            <w:r>
+              <w:rPr>
+                <w:rFonts w:ascii="Arial" w:cs="Arial" w:eastAsia="Arial" w:hAnsi="Arial"/>
+                <w:b/>
+                <w:bCs/>
+                <w:color w:val="212121"/>
+                <w:sz w:val="20"/>
+                <w:szCs w:val="20"/>
+              </w:rPr>
+              <w:t xml:space="preserve">Usuario (accounts.hetzner.com)</w:t>
+            </w:r>
+          </w:p>
+        </w:tc>
+        <w:tc>
+          <w:tcPr>
+            <w:tcW w:type="dxa" w:w="6360"/>
+            <w:tcBorders>
+              <w:top w:val="single" w:color="E0E0E0" w:sz="1"/>
+              <w:left w:val="single" w:color="E0E0E0" w:sz="1"/>
+              <w:bottom w:val="single" w:color="E0E0E0" w:sz="1"/>
+              <w:right w:val="single" w:color="E0E0E0" w:sz="1"/>
+            </w:tcBorders>
+            <w:tcMar>
+              <w:top w:type="dxa" w:w="80"/>
+              <w:left w:type="dxa" w:w="120"/>
+              <w:bottom w:type="dxa" w:w="80"/>
+              <w:right w:type="dxa" w:w="120"/>
+            </w:tcMar>
+          </w:tcPr>
+          <w:p>
+            <w:r>
+              <w:rPr>
+                <w:rFonts w:ascii="Arial" w:cs="Arial" w:eastAsia="Arial" w:hAnsi="Arial"/>
+                <w:b/>
+                <w:bCs/>
+                <w:color w:val="212121"/>
+                <w:sz w:val="20"/>
+                <w:szCs w:val="20"/>
+              </w:rPr>
+              <w:t xml:space="preserve">________________________________________</w:t>
+            </w:r>
+          </w:p>
+        </w:tc>
+      </w:tr>
+      <w:tr>
+        <w:tc>
+          <w:tcPr>
+            <w:tcW w:type="dxa" w:w="3000"/>
+            <w:tcBorders>
+              <w:top w:val="single" w:color="E0E0E0" w:sz="1"/>
+              <w:left w:val="single" w:color="E0E0E0" w:sz="1"/>
+              <w:bottom w:val="single" w:color="E0E0E0" w:sz="1"/>
+              <w:right w:val="single" w:color="E0E0E0" w:sz="1"/>
+            </w:tcBorders>
+            <w:shd w:fill="FFF3E0" w:val="clear"/>
+            <w:tcMar>
+              <w:top w:type="dxa" w:w="80"/>
+              <w:left w:type="dxa" w:w="120"/>
+              <w:bottom w:type="dxa" w:w="80"/>
+              <w:right w:type="dxa" w:w="120"/>
+            </w:tcMar>
+          </w:tcPr>
+          <w:p>
+            <w:r>
+              <w:rPr>
+                <w:rFonts w:ascii="Arial" w:cs="Arial" w:eastAsia="Arial" w:hAnsi="Arial"/>
+                <w:b/>
+                <w:bCs/>
+                <w:color w:val="212121"/>
+                <w:sz w:val="20"/>
+                <w:szCs w:val="20"/>
+              </w:rPr>
+              <w:t xml:space="preserve">Contraseña</w:t>
+            </w:r>
+          </w:p>
+        </w:tc>
+        <w:tc>
+          <w:tcPr>
+            <w:tcW w:type="dxa" w:w="6360"/>
+            <w:tcBorders>
+              <w:top w:val="single" w:color="E0E0E0" w:sz="1"/>
+              <w:left w:val="single" w:color="E0E0E0" w:sz="1"/>
+              <w:bottom w:val="single" w:color="E0E0E0" w:sz="1"/>
+              <w:right w:val="single" w:color="E0E0E0" w:sz="1"/>
+            </w:tcBorders>
+            <w:tcMar>
+              <w:top w:type="dxa" w:w="80"/>
+              <w:left w:type="dxa" w:w="120"/>
+              <w:bottom w:type="dxa" w:w="80"/>
+              <w:right w:type="dxa" w:w="120"/>
+            </w:tcMar>
+          </w:tcPr>
+          <w:p>
+            <w:r>
+              <w:rPr>
+                <w:rFonts w:ascii="Arial" w:cs="Arial" w:eastAsia="Arial" w:hAnsi="Arial"/>
+                <w:b/>
+                <w:bCs/>
+                <w:color w:val="212121"/>
+                <w:sz w:val="20"/>
+                <w:szCs w:val="20"/>
+              </w:rPr>
+              <w:t xml:space="preserve">________________________________________</w:t>
+            </w:r>
+          </w:p>
+        </w:tc>
+      </w:tr>
+    </w:tbl>
     <w:p>
       <w:pPr>
         <w:spacing w:after="0" w:before="80"/>
@@ -2909,7 +3061,7 @@
           <w:sz w:val="20"/>
           <w:szCs w:val="20"/>
         </w:rPr>
-        <w:t xml:space="preserve"> y cree una cuenta con el correo de la cuenta de Google y los datos de la empresa.</w:t>
+        <w:t xml:space="preserve"> con el usuario y la contraseña de arriba.</w:t>
       </w:r>
     </w:p>
     <w:p>
@@ -2948,7 +3100,7 @@
           <w:sz w:val="20"/>
           <w:szCs w:val="20"/>
         </w:rPr>
-        <w:t xml:space="preserve"> agregue la tarjeta.</w:t>
+        <w:t xml:space="preserve"> agregue la tarjeta de la empresa.</w:t>
       </w:r>
     </w:p>
     <w:p>
@@ -2967,7 +3119,7 @@
           <w:sz w:val="20"/>
           <w:szCs w:val="20"/>
         </w:rPr>
-        <w:t xml:space="preserve">Avise a raaamp el correo de la cuenta. raaamp traslada el servidor a esa cuenta sin interrumpir el servicio y conserva el acceso técnico para operarlo.</w:t>
+        <w:t xml:space="preserve">Avise a raaamp. raaamp traslada el servidor a esta cuenta sin interrumpir el servicio y conserva el acceso técnico para operarlo.</w:t>
       </w:r>
     </w:p>
     <w:p>
@@ -4019,7 +4171,7 @@
           <w:sz w:val="20"/>
           <w:szCs w:val="20"/>
         </w:rPr>
-        <w:t xml:space="preserve">Cuenta de Hetzner creada con tarjeta y correo enviado a raaamp.</w:t>
+        <w:t xml:space="preserve">Tarjeta agregada en la cuenta de Hetzner y aviso enviado a raaamp.</w:t>
       </w:r>
     </w:p>
     <w:p>

</xml_diff>

<commit_message>
docs(guía cliente): sin contraseña de Hetzner, Hetzner US$10/mes verificado, 'método de pago' en vez de 'tarjeta'; entrega v2 con US$10
</commit_message>
<xml_diff>
--- a/docs/Guia_Metodos_de_Pago_DePaseoEnFincas.docx
+++ b/docs/Guia_Metodos_de_Pago_DePaseoEnFincas.docx
@@ -163,7 +163,7 @@
           <w:sz w:val="20"/>
           <w:szCs w:val="20"/>
         </w:rPr>
-        <w:t xml:space="preserve">Documento CONFIDENCIAL: contiene contraseñas (secciones 1 y 3.4). No reenviar.</w:t>
+        <w:t xml:space="preserve">Documento CONFIDENCIAL: la primera página contiene la contraseña de la cuenta. No reenviar.</w:t>
       </w:r>
     </w:p>
     <w:p>
@@ -499,7 +499,7 @@
           <w:sz w:val="22"/>
           <w:szCs w:val="22"/>
         </w:rPr>
-        <w:t xml:space="preserve">Estos son los servicios que hacen funcionar al asistente. Tres de ellos cobran por uso y necesitan una tarjeta vigente de De Paseo en Fincas (sección 3). El asistente ya está conectado a las cuentas de Gemini y OpenAI de la empresa: hasta que tengan facturación y saldo, el asistente permanece en espera y no responde a los clientes.</w:t>
+        <w:t xml:space="preserve">Estos son los servicios que hacen funcionar al asistente. Cuatro de ellos cobran y necesitan un método de pago vigente de De Paseo en Fincas (sección 3). El asistente ya está conectado a las cuentas de Gemini y OpenAI de la empresa: hasta que tengan facturación y saldo, el asistente permanece en espera y no responde a los clientes.</w:t>
       </w:r>
     </w:p>
     <w:p>
@@ -647,7 +647,7 @@
                 <w:sz w:val="20"/>
                 <w:szCs w:val="20"/>
               </w:rPr>
-              <w:t xml:space="preserve">Tarjeta</w:t>
+              <w:t xml:space="preserve">Método de pago</w:t>
             </w:r>
           </w:p>
         </w:tc>
@@ -1246,7 +1246,7 @@
                 <w:sz w:val="20"/>
                 <w:szCs w:val="20"/>
               </w:rPr>
-              <w:t xml:space="preserve">US$18 al mes</w:t>
+              <w:t xml:space="preserve">US$10 al mes</w:t>
             </w:r>
           </w:p>
         </w:tc>
@@ -1972,7 +1972,7 @@
         <w:pStyle w:val="Heading1"/>
       </w:pPr>
       <w:r>
-        <w:t xml:space="preserve">3. Paso a paso para poner las tarjetas</w:t>
+        <w:t xml:space="preserve">3. Paso a paso para poner los métodos de pago</w:t>
       </w:r>
     </w:p>
     <w:p>
@@ -2054,7 +2054,7 @@
                 <w:sz w:val="20"/>
                 <w:szCs w:val="20"/>
               </w:rPr>
-              <w:t xml:space="preserve">WhatsApp Manager muestra "Se requiere un método de pago válido: tu método de pago caducó o no es válido" en la cuenta "De Paseo En Fincas raaamp". Meta regala 1.000 conversaciones al mes; al agotarse, bloquea el envío y el asistente deja de responder. Los mensajes con plantilla (seguimientos y avisos al asesor) se cobran y no salen sin tarjeta.</w:t>
+              <w:t xml:space="preserve">WhatsApp Manager muestra "Se requiere un método de pago válido: tu método de pago caducó o no es válido" en la cuenta "De Paseo En Fincas raaamp". Meta regala 1.000 conversaciones al mes; al agotarse, bloquea el envío y el asistente deja de responder. Los mensajes con plantilla (seguimientos y avisos al asesor) se cobran y no salen sin un método de pago válido.</w:t>
             </w:r>
           </w:p>
         </w:tc>
@@ -2258,7 +2258,7 @@
           <w:sz w:val="20"/>
           <w:szCs w:val="20"/>
         </w:rPr>
-        <w:t xml:space="preserve">: tarjeta de crédito o débito vigente a nombre de la empresa, moneda y datos de facturación. Guarde.</w:t>
+        <w:t xml:space="preserve">: método de pago vigente a nombre de la empresa (tarjeta de crédito o débito), moneda y datos de facturación. Guarde.</w:t>
       </w:r>
     </w:p>
     <w:p>
@@ -2401,7 +2401,7 @@
           <w:sz w:val="20"/>
           <w:szCs w:val="20"/>
         </w:rPr>
-        <w:t xml:space="preserve">. País: Colombia. Tipo de cuenta: Empresa. Complete nombre, dirección y la tarjeta. Guarde.</w:t>
+        <w:t xml:space="preserve">. País: Colombia. Tipo de cuenta: Empresa. Complete nombre, dirección y el método de pago. Guarde.</w:t>
       </w:r>
     </w:p>
     <w:p>
@@ -2642,7 +2642,7 @@
                 <w:sz w:val="20"/>
                 <w:szCs w:val="20"/>
               </w:rPr>
-              <w:t xml:space="preserve">Es un rechazo del perfil de pagos de Google. Haga esto, en orden: (1) Entre a pay.google.com con la misma cuenta, abra Configuración y compruebe que el país sea Colombia y que no haya avisos de verificación pendiente; agregue ahí la tarjeta en "Formas de pago". (2) Vuelva a console.cloud.google.com/billing y repita la creación de la cuenta de facturación en una ventana de incógnito, con solo esta cuenta de Google abierta. (3) Si vuelve a fallar, use otra tarjeta de crédito habilitada para compras internacionales por internet (pídale al banco que la habilite si hace falta). (4) Si persiste, espere 24 horas y repita; si aun así falla, abra un caso en "Soporte" dentro de la consola de Google Cloud citando el código OR-CBAT-14.</w:t>
+              <w:t xml:space="preserve">Es un rechazo del perfil de pagos de Google. Haga esto, en orden: (1) Entre a pay.google.com con la misma cuenta, abra Configuración y compruebe que el país sea Colombia y que no haya avisos de verificación pendiente; agregue ahí el método de pago en "Formas de pago". (2) Vuelva a console.cloud.google.com/billing y repita la creación de la cuenta de facturación en una ventana de incógnito, con solo esta cuenta de Google abierta. (3) Si vuelve a fallar, use otro método de pago: una tarjeta de crédito habilitada para compras internacionales por internet (pídale al banco que la habilite si hace falta). (4) Si persiste, espere 24 horas y repita; si aun así falla, abra un caso en "Soporte" dentro de la consola de Google Cloud citando el código OR-CBAT-14.</w:t>
             </w:r>
           </w:p>
         </w:tc>
@@ -2750,7 +2750,7 @@
           <w:sz w:val="20"/>
           <w:szCs w:val="20"/>
         </w:rPr>
-        <w:t xml:space="preserve"> y agregue la tarjeta.</w:t>
+        <w:t xml:space="preserve"> y agregue el método de pago.</w:t>
       </w:r>
     </w:p>
     <w:p>
@@ -2869,157 +2869,9 @@
           <w:sz w:val="22"/>
           <w:szCs w:val="22"/>
         </w:rPr>
-        <w:t xml:space="preserve">El servidor donde corren n8n y Chatwoot está hoy en la cuenta de raaamp. De Paseo en Fincas ya tiene su cuenta en Hetzner; falta agregarle la tarjeta para que el servidor pase a esa cuenta y la factura mensual llegue a la empresa.</w:t>
-      </w:r>
-    </w:p>
-    <w:p>
-      <w:pPr>
-        <w:spacing w:after="0" w:before="80"/>
-      </w:pPr>
-    </w:p>
-    <w:tbl>
-      <w:tblPr>
-        <w:tblW w:type="dxa" w:w="9360"/>
-        <w:tblBorders>
-          <w:top w:val="single" w:color="auto" w:sz="4"/>
-          <w:left w:val="single" w:color="auto" w:sz="4"/>
-          <w:bottom w:val="single" w:color="auto" w:sz="4"/>
-          <w:right w:val="single" w:color="auto" w:sz="4"/>
-          <w:insideH w:val="single" w:color="auto" w:sz="4"/>
-          <w:insideV w:val="single" w:color="auto" w:sz="4"/>
-        </w:tblBorders>
-      </w:tblPr>
-      <w:tblGrid>
-        <w:gridCol w:w="3000"/>
-        <w:gridCol w:w="6360"/>
-      </w:tblGrid>
-      <w:tr>
-        <w:tc>
-          <w:tcPr>
-            <w:tcW w:type="dxa" w:w="3000"/>
-            <w:tcBorders>
-              <w:top w:val="single" w:color="E0E0E0" w:sz="1"/>
-              <w:left w:val="single" w:color="E0E0E0" w:sz="1"/>
-              <w:bottom w:val="single" w:color="E0E0E0" w:sz="1"/>
-              <w:right w:val="single" w:color="E0E0E0" w:sz="1"/>
-            </w:tcBorders>
-            <w:shd w:fill="FFF3E0" w:val="clear"/>
-            <w:tcMar>
-              <w:top w:type="dxa" w:w="80"/>
-              <w:left w:type="dxa" w:w="120"/>
-              <w:bottom w:type="dxa" w:w="80"/>
-              <w:right w:type="dxa" w:w="120"/>
-            </w:tcMar>
-          </w:tcPr>
-          <w:p>
-            <w:r>
-              <w:rPr>
-                <w:rFonts w:ascii="Arial" w:cs="Arial" w:eastAsia="Arial" w:hAnsi="Arial"/>
-                <w:b/>
-                <w:bCs/>
-                <w:color w:val="212121"/>
-                <w:sz w:val="20"/>
-                <w:szCs w:val="20"/>
-              </w:rPr>
-              <w:t xml:space="preserve">Usuario (accounts.hetzner.com)</w:t>
-            </w:r>
-          </w:p>
-        </w:tc>
-        <w:tc>
-          <w:tcPr>
-            <w:tcW w:type="dxa" w:w="6360"/>
-            <w:tcBorders>
-              <w:top w:val="single" w:color="E0E0E0" w:sz="1"/>
-              <w:left w:val="single" w:color="E0E0E0" w:sz="1"/>
-              <w:bottom w:val="single" w:color="E0E0E0" w:sz="1"/>
-              <w:right w:val="single" w:color="E0E0E0" w:sz="1"/>
-            </w:tcBorders>
-            <w:tcMar>
-              <w:top w:type="dxa" w:w="80"/>
-              <w:left w:type="dxa" w:w="120"/>
-              <w:bottom w:type="dxa" w:w="80"/>
-              <w:right w:type="dxa" w:w="120"/>
-            </w:tcMar>
-          </w:tcPr>
-          <w:p>
-            <w:r>
-              <w:rPr>
-                <w:rFonts w:ascii="Arial" w:cs="Arial" w:eastAsia="Arial" w:hAnsi="Arial"/>
-                <w:b/>
-                <w:bCs/>
-                <w:color w:val="212121"/>
-                <w:sz w:val="20"/>
-                <w:szCs w:val="20"/>
-              </w:rPr>
-              <w:t xml:space="preserve">________________________________________</w:t>
-            </w:r>
-          </w:p>
-        </w:tc>
-      </w:tr>
-      <w:tr>
-        <w:tc>
-          <w:tcPr>
-            <w:tcW w:type="dxa" w:w="3000"/>
-            <w:tcBorders>
-              <w:top w:val="single" w:color="E0E0E0" w:sz="1"/>
-              <w:left w:val="single" w:color="E0E0E0" w:sz="1"/>
-              <w:bottom w:val="single" w:color="E0E0E0" w:sz="1"/>
-              <w:right w:val="single" w:color="E0E0E0" w:sz="1"/>
-            </w:tcBorders>
-            <w:shd w:fill="FFF3E0" w:val="clear"/>
-            <w:tcMar>
-              <w:top w:type="dxa" w:w="80"/>
-              <w:left w:type="dxa" w:w="120"/>
-              <w:bottom w:type="dxa" w:w="80"/>
-              <w:right w:type="dxa" w:w="120"/>
-            </w:tcMar>
-          </w:tcPr>
-          <w:p>
-            <w:r>
-              <w:rPr>
-                <w:rFonts w:ascii="Arial" w:cs="Arial" w:eastAsia="Arial" w:hAnsi="Arial"/>
-                <w:b/>
-                <w:bCs/>
-                <w:color w:val="212121"/>
-                <w:sz w:val="20"/>
-                <w:szCs w:val="20"/>
-              </w:rPr>
-              <w:t xml:space="preserve">Contraseña</w:t>
-            </w:r>
-          </w:p>
-        </w:tc>
-        <w:tc>
-          <w:tcPr>
-            <w:tcW w:type="dxa" w:w="6360"/>
-            <w:tcBorders>
-              <w:top w:val="single" w:color="E0E0E0" w:sz="1"/>
-              <w:left w:val="single" w:color="E0E0E0" w:sz="1"/>
-              <w:bottom w:val="single" w:color="E0E0E0" w:sz="1"/>
-              <w:right w:val="single" w:color="E0E0E0" w:sz="1"/>
-            </w:tcBorders>
-            <w:tcMar>
-              <w:top w:type="dxa" w:w="80"/>
-              <w:left w:type="dxa" w:w="120"/>
-              <w:bottom w:type="dxa" w:w="80"/>
-              <w:right w:type="dxa" w:w="120"/>
-            </w:tcMar>
-          </w:tcPr>
-          <w:p>
-            <w:r>
-              <w:rPr>
-                <w:rFonts w:ascii="Arial" w:cs="Arial" w:eastAsia="Arial" w:hAnsi="Arial"/>
-                <w:b/>
-                <w:bCs/>
-                <w:color w:val="212121"/>
-                <w:sz w:val="20"/>
-                <w:szCs w:val="20"/>
-              </w:rPr>
-              <w:t xml:space="preserve">________________________________________</w:t>
-            </w:r>
-          </w:p>
-        </w:tc>
-      </w:tr>
-    </w:tbl>
+        <w:t xml:space="preserve">El servidor donde corren n8n y Chatwoot está hoy en la cuenta de raaamp. De Paseo en Fincas ya tiene su cuenta en Hetzner; falta agregarle el método de pago para que el servidor pase a esa cuenta y la factura mensual llegue a la empresa.</w:t>
+      </w:r>
+    </w:p>
     <w:p>
       <w:pPr>
         <w:spacing w:after="0" w:before="80"/>
@@ -3061,7 +2913,7 @@
           <w:sz w:val="20"/>
           <w:szCs w:val="20"/>
         </w:rPr>
-        <w:t xml:space="preserve"> con el usuario y la contraseña de arriba.</w:t>
+        <w:t xml:space="preserve"> con el correo de la cuenta de Google (sección 1) y la contraseña de Hetzner.</w:t>
       </w:r>
     </w:p>
     <w:p>
@@ -3100,7 +2952,7 @@
           <w:sz w:val="20"/>
           <w:szCs w:val="20"/>
         </w:rPr>
-        <w:t xml:space="preserve"> agregue la tarjeta de la empresa.</w:t>
+        <w:t xml:space="preserve"> agregue el método de pago de la empresa.</w:t>
       </w:r>
     </w:p>
     <w:p>
@@ -3138,7 +2990,7 @@
           <w:sz w:val="20"/>
           <w:szCs w:val="20"/>
         </w:rPr>
-        <w:t xml:space="preserve">Desde ese momento la factura de Hetzner (aprox. US$18 al mes) llega al correo de la empresa.</w:t>
+        <w:t xml:space="preserve">Desde ese momento la factura de Hetzner (US$10 al mes) llega al correo de la empresa.</w:t>
       </w:r>
     </w:p>
     <w:p>
@@ -4114,7 +3966,7 @@
           <w:sz w:val="20"/>
           <w:szCs w:val="20"/>
         </w:rPr>
-        <w:t xml:space="preserve">Tarjeta agregada en Meta y alerta amarilla desaparecida.</w:t>
+        <w:t xml:space="preserve">Método de pago agregado en Meta y alerta amarilla desaparecida.</w:t>
       </w:r>
     </w:p>
     <w:p>
@@ -4171,7 +4023,7 @@
           <w:sz w:val="20"/>
           <w:szCs w:val="20"/>
         </w:rPr>
-        <w:t xml:space="preserve">Tarjeta agregada en la cuenta de Hetzner y aviso enviado a raaamp.</w:t>
+        <w:t xml:space="preserve">Método de pago agregado en la cuenta de Hetzner y aviso enviado a raaamp.</w:t>
       </w:r>
     </w:p>
     <w:p>

</xml_diff>

<commit_message>
docs(guía cliente): Hetzner con credenciales y reemplazo de tarjeta, sin teléfono de recuperación, sin sección 'qué pasa si falta un pago', sin avisos a raaamp
</commit_message>
<xml_diff>
--- a/docs/Guia_Metodos_de_Pago_DePaseoEnFincas.docx
+++ b/docs/Guia_Metodos_de_Pago_DePaseoEnFincas.docx
@@ -163,7 +163,7 @@
           <w:sz w:val="20"/>
           <w:szCs w:val="20"/>
         </w:rPr>
-        <w:t xml:space="preserve">Documento CONFIDENCIAL: la primera página contiene la contraseña de la cuenta. No reenviar.</w:t>
+        <w:t xml:space="preserve">Documento CONFIDENCIAL: contiene contraseñas (secciones 1 y 3.4). No reenviar.</w:t>
       </w:r>
     </w:p>
     <w:p>
@@ -336,67 +336,6 @@
                 <w:rFonts w:ascii="Arial" w:cs="Arial" w:eastAsia="Arial" w:hAnsi="Arial"/>
                 <w:b/>
                 <w:bCs/>
-                <w:color w:val="212121"/>
-                <w:sz w:val="20"/>
-                <w:szCs w:val="20"/>
-              </w:rPr>
-              <w:t xml:space="preserve">________________________________________</w:t>
-            </w:r>
-          </w:p>
-        </w:tc>
-      </w:tr>
-      <w:tr>
-        <w:tc>
-          <w:tcPr>
-            <w:tcW w:type="dxa" w:w="3000"/>
-            <w:tcBorders>
-              <w:top w:val="single" w:color="E0E0E0" w:sz="1"/>
-              <w:left w:val="single" w:color="E0E0E0" w:sz="1"/>
-              <w:bottom w:val="single" w:color="E0E0E0" w:sz="1"/>
-              <w:right w:val="single" w:color="E0E0E0" w:sz="1"/>
-            </w:tcBorders>
-            <w:shd w:fill="FFF3E0" w:val="clear"/>
-            <w:tcMar>
-              <w:top w:type="dxa" w:w="80"/>
-              <w:left w:type="dxa" w:w="120"/>
-              <w:bottom w:type="dxa" w:w="80"/>
-              <w:right w:type="dxa" w:w="120"/>
-            </w:tcMar>
-          </w:tcPr>
-          <w:p>
-            <w:r>
-              <w:rPr>
-                <w:rFonts w:ascii="Arial" w:cs="Arial" w:eastAsia="Arial" w:hAnsi="Arial"/>
-                <w:b/>
-                <w:bCs/>
-                <w:color w:val="212121"/>
-                <w:sz w:val="20"/>
-                <w:szCs w:val="20"/>
-              </w:rPr>
-              <w:t xml:space="preserve">Teléfono de recuperación</w:t>
-            </w:r>
-          </w:p>
-        </w:tc>
-        <w:tc>
-          <w:tcPr>
-            <w:tcW w:type="dxa" w:w="6360"/>
-            <w:tcBorders>
-              <w:top w:val="single" w:color="E0E0E0" w:sz="1"/>
-              <w:left w:val="single" w:color="E0E0E0" w:sz="1"/>
-              <w:bottom w:val="single" w:color="E0E0E0" w:sz="1"/>
-              <w:right w:val="single" w:color="E0E0E0" w:sz="1"/>
-            </w:tcBorders>
-            <w:tcMar>
-              <w:top w:type="dxa" w:w="80"/>
-              <w:left w:type="dxa" w:w="120"/>
-              <w:bottom w:type="dxa" w:w="80"/>
-              <w:right w:type="dxa" w:w="120"/>
-            </w:tcMar>
-          </w:tcPr>
-          <w:p>
-            <w:r>
-              <w:rPr>
-                <w:rFonts w:ascii="Arial" w:cs="Arial" w:eastAsia="Arial" w:hAnsi="Arial"/>
                 <w:color w:val="212121"/>
                 <w:sz w:val="20"/>
                 <w:szCs w:val="20"/>
@@ -736,7 +675,7 @@
                 <w:sz w:val="20"/>
                 <w:szCs w:val="20"/>
               </w:rPr>
-              <w:t xml:space="preserve">La línea con la que el asistente atiende a los clientes: hoy +1 201-701-8810, que pasará a +57 310 5639334 (sección 5)</w:t>
+              <w:t xml:space="preserve">La línea con la que el asistente atiende a los clientes: hoy +1 201-701-8810, que pasará a +57 310 5639334 (sección 4)</w:t>
             </w:r>
           </w:p>
         </w:tc>
@@ -1190,7 +1129,7 @@
                 <w:sz w:val="20"/>
                 <w:szCs w:val="20"/>
               </w:rPr>
-              <w:t xml:space="preserve">accounts.hetzner.com, con el correo de la cuenta de Google</w:t>
+              <w:t xml:space="preserve">accounts.hetzner.com, con el usuario y la contraseña de la sección 3.4</w:t>
             </w:r>
           </w:p>
         </w:tc>
@@ -1986,7 +1925,7 @@
           <w:sz w:val="22"/>
           <w:szCs w:val="22"/>
         </w:rPr>
-        <w:t xml:space="preserve">Haga los pasos en este orden. Al terminar cada uno, avise a raaamp para que verifique que el asistente volvió a operar.</w:t>
+        <w:t xml:space="preserve">Haga los pasos en este orden.</w:t>
       </w:r>
     </w:p>
     <w:p>
@@ -2563,25 +2502,6 @@
     </w:p>
     <w:p>
       <w:pPr>
-        <w:pStyle w:val="ListParagraph"/>
-        <w:numPr>
-          <w:ilvl w:val="0"/>
-          <w:numId w:val="3"/>
-        </w:numPr>
-        <w:spacing w:after="60"/>
-      </w:pPr>
-      <w:r>
-        <w:rPr>
-          <w:rFonts w:ascii="Arial" w:cs="Arial" w:eastAsia="Arial" w:hAnsi="Arial"/>
-          <w:color w:val="212121"/>
-          <w:sz w:val="20"/>
-          <w:szCs w:val="20"/>
-        </w:rPr>
-        <w:t xml:space="preserve">Avise a raaamp para que confirme que el asistente responde.</w:t>
-      </w:r>
-    </w:p>
-    <w:p>
-      <w:pPr>
         <w:spacing w:after="0" w:before="100"/>
       </w:pPr>
     </w:p>
@@ -2833,25 +2753,6 @@
     </w:p>
     <w:p>
       <w:pPr>
-        <w:pStyle w:val="ListParagraph"/>
-        <w:numPr>
-          <w:ilvl w:val="0"/>
-          <w:numId w:val="4"/>
-        </w:numPr>
-        <w:spacing w:after="60"/>
-      </w:pPr>
-      <w:r>
-        <w:rPr>
-          <w:rFonts w:ascii="Arial" w:cs="Arial" w:eastAsia="Arial" w:hAnsi="Arial"/>
-          <w:color w:val="212121"/>
-          <w:sz w:val="20"/>
-          <w:szCs w:val="20"/>
-        </w:rPr>
-        <w:t xml:space="preserve">Avise a raaamp para probar con una nota de voz real.</w:t>
-      </w:r>
-    </w:p>
-    <w:p>
-      <w:pPr>
         <w:pStyle w:val="Heading2"/>
       </w:pPr>
       <w:r>
@@ -2869,142 +2770,13 @@
           <w:sz w:val="22"/>
           <w:szCs w:val="22"/>
         </w:rPr>
-        <w:t xml:space="preserve">El servidor donde corren n8n y Chatwoot está hoy en la cuenta de raaamp. De Paseo en Fincas ya tiene su cuenta en Hetzner; falta agregarle el método de pago para que el servidor pase a esa cuenta y la factura mensual llegue a la empresa.</w:t>
+        <w:t xml:space="preserve">El servidor donde corren n8n y Chatwoot está en la cuenta de Hetzner de De Paseo en Fincas. Hoy esa cuenta tiene registrada la tarjeta de raaamp; hay que reemplazarla por el método de pago de la empresa (US$10 al mes).</w:t>
       </w:r>
     </w:p>
     <w:p>
       <w:pPr>
         <w:spacing w:after="0" w:before="80"/>
       </w:pPr>
-    </w:p>
-    <w:p>
-      <w:pPr>
-        <w:pStyle w:val="ListParagraph"/>
-        <w:numPr>
-          <w:ilvl w:val="0"/>
-          <w:numId w:val="5"/>
-        </w:numPr>
-        <w:spacing w:after="60"/>
-      </w:pPr>
-      <w:r>
-        <w:rPr>
-          <w:rFonts w:ascii="Arial" w:cs="Arial" w:eastAsia="Arial" w:hAnsi="Arial"/>
-          <w:color w:val="212121"/>
-          <w:sz w:val="20"/>
-          <w:szCs w:val="20"/>
-        </w:rPr>
-        <w:t xml:space="preserve">Entre a </w:t>
-      </w:r>
-      <w:r>
-        <w:rPr>
-          <w:rFonts w:ascii="Arial" w:cs="Arial" w:eastAsia="Arial" w:hAnsi="Arial"/>
-          <w:b/>
-          <w:bCs/>
-          <w:color w:val="212121"/>
-          <w:sz w:val="20"/>
-          <w:szCs w:val="20"/>
-        </w:rPr>
-        <w:t xml:space="preserve">accounts.hetzner.com</w:t>
-      </w:r>
-      <w:r>
-        <w:rPr>
-          <w:rFonts w:ascii="Arial" w:cs="Arial" w:eastAsia="Arial" w:hAnsi="Arial"/>
-          <w:color w:val="212121"/>
-          <w:sz w:val="20"/>
-          <w:szCs w:val="20"/>
-        </w:rPr>
-        <w:t xml:space="preserve"> con el correo de la cuenta de Google (sección 1) y la contraseña de Hetzner.</w:t>
-      </w:r>
-    </w:p>
-    <w:p>
-      <w:pPr>
-        <w:pStyle w:val="ListParagraph"/>
-        <w:numPr>
-          <w:ilvl w:val="0"/>
-          <w:numId w:val="5"/>
-        </w:numPr>
-        <w:spacing w:after="60"/>
-      </w:pPr>
-      <w:r>
-        <w:rPr>
-          <w:rFonts w:ascii="Arial" w:cs="Arial" w:eastAsia="Arial" w:hAnsi="Arial"/>
-          <w:color w:val="212121"/>
-          <w:sz w:val="20"/>
-          <w:szCs w:val="20"/>
-        </w:rPr>
-        <w:t xml:space="preserve">En </w:t>
-      </w:r>
-      <w:r>
-        <w:rPr>
-          <w:rFonts w:ascii="Arial" w:cs="Arial" w:eastAsia="Arial" w:hAnsi="Arial"/>
-          <w:b/>
-          <w:bCs/>
-          <w:color w:val="212121"/>
-          <w:sz w:val="20"/>
-          <w:szCs w:val="20"/>
-        </w:rPr>
-        <w:t xml:space="preserve">Payment methods</w:t>
-      </w:r>
-      <w:r>
-        <w:rPr>
-          <w:rFonts w:ascii="Arial" w:cs="Arial" w:eastAsia="Arial" w:hAnsi="Arial"/>
-          <w:color w:val="212121"/>
-          <w:sz w:val="20"/>
-          <w:szCs w:val="20"/>
-        </w:rPr>
-        <w:t xml:space="preserve"> agregue el método de pago de la empresa.</w:t>
-      </w:r>
-    </w:p>
-    <w:p>
-      <w:pPr>
-        <w:pStyle w:val="ListParagraph"/>
-        <w:numPr>
-          <w:ilvl w:val="0"/>
-          <w:numId w:val="5"/>
-        </w:numPr>
-        <w:spacing w:after="60"/>
-      </w:pPr>
-      <w:r>
-        <w:rPr>
-          <w:rFonts w:ascii="Arial" w:cs="Arial" w:eastAsia="Arial" w:hAnsi="Arial"/>
-          <w:color w:val="212121"/>
-          <w:sz w:val="20"/>
-          <w:szCs w:val="20"/>
-        </w:rPr>
-        <w:t xml:space="preserve">Avise a raaamp. raaamp traslada el servidor a esta cuenta sin interrumpir el servicio y conserva el acceso técnico para operarlo.</w:t>
-      </w:r>
-    </w:p>
-    <w:p>
-      <w:pPr>
-        <w:pStyle w:val="ListParagraph"/>
-        <w:numPr>
-          <w:ilvl w:val="0"/>
-          <w:numId w:val="5"/>
-        </w:numPr>
-        <w:spacing w:after="60"/>
-      </w:pPr>
-      <w:r>
-        <w:rPr>
-          <w:rFonts w:ascii="Arial" w:cs="Arial" w:eastAsia="Arial" w:hAnsi="Arial"/>
-          <w:color w:val="212121"/>
-          <w:sz w:val="20"/>
-          <w:szCs w:val="20"/>
-        </w:rPr>
-        <w:t xml:space="preserve">Desde ese momento la factura de Hetzner (US$10 al mes) llega al correo de la empresa.</w:t>
-      </w:r>
-    </w:p>
-    <w:p>
-      <w:r>
-        <w:br w:type="page"/>
-      </w:r>
-    </w:p>
-    <w:p>
-      <w:pPr>
-        <w:pStyle w:val="Heading1"/>
-      </w:pPr>
-      <w:r>
-        <w:t xml:space="preserve">4. Qué pasa si falta un pago</w:t>
-      </w:r>
     </w:p>
     <w:tbl>
       <w:tblPr>
@@ -3019,21 +2791,20 @@
         </w:tblBorders>
       </w:tblPr>
       <w:tblGrid>
-        <w:gridCol w:w="2000"/>
-        <w:gridCol w:w="3700"/>
-        <w:gridCol w:w="3660"/>
+        <w:gridCol w:w="3000"/>
+        <w:gridCol w:w="6360"/>
       </w:tblGrid>
       <w:tr>
         <w:tc>
           <w:tcPr>
-            <w:tcW w:type="dxa" w:w="2000"/>
-            <w:tcBorders>
-              <w:top w:val="single" w:color="E0E0E0" w:sz="1"/>
-              <w:left w:val="single" w:color="E0E0E0" w:sz="1"/>
-              <w:bottom w:val="single" w:color="E0E0E0" w:sz="1"/>
-              <w:right w:val="single" w:color="E0E0E0" w:sz="1"/>
-            </w:tcBorders>
-            <w:shd w:fill="2E7D32" w:val="clear"/>
+            <w:tcW w:type="dxa" w:w="3000"/>
+            <w:tcBorders>
+              <w:top w:val="single" w:color="E0E0E0" w:sz="1"/>
+              <w:left w:val="single" w:color="E0E0E0" w:sz="1"/>
+              <w:bottom w:val="single" w:color="E0E0E0" w:sz="1"/>
+              <w:right w:val="single" w:color="E0E0E0" w:sz="1"/>
+            </w:tcBorders>
+            <w:shd w:fill="FFF3E0" w:val="clear"/>
             <w:tcMar>
               <w:top w:type="dxa" w:w="80"/>
               <w:left w:type="dxa" w:w="120"/>
@@ -3047,24 +2818,23 @@
                 <w:rFonts w:ascii="Arial" w:cs="Arial" w:eastAsia="Arial" w:hAnsi="Arial"/>
                 <w:b/>
                 <w:bCs/>
-                <w:color w:val="FFFFFF"/>
-                <w:sz w:val="20"/>
-                <w:szCs w:val="20"/>
-              </w:rPr>
-              <w:t xml:space="preserve">Servicio</w:t>
-            </w:r>
-          </w:p>
-        </w:tc>
-        <w:tc>
-          <w:tcPr>
-            <w:tcW w:type="dxa" w:w="3700"/>
-            <w:tcBorders>
-              <w:top w:val="single" w:color="E0E0E0" w:sz="1"/>
-              <w:left w:val="single" w:color="E0E0E0" w:sz="1"/>
-              <w:bottom w:val="single" w:color="E0E0E0" w:sz="1"/>
-              <w:right w:val="single" w:color="E0E0E0" w:sz="1"/>
-            </w:tcBorders>
-            <w:shd w:fill="2E7D32" w:val="clear"/>
+                <w:color w:val="212121"/>
+                <w:sz w:val="20"/>
+                <w:szCs w:val="20"/>
+              </w:rPr>
+              <w:t xml:space="preserve">Usuario (accounts.hetzner.com)</w:t>
+            </w:r>
+          </w:p>
+        </w:tc>
+        <w:tc>
+          <w:tcPr>
+            <w:tcW w:type="dxa" w:w="6360"/>
+            <w:tcBorders>
+              <w:top w:val="single" w:color="E0E0E0" w:sz="1"/>
+              <w:left w:val="single" w:color="E0E0E0" w:sz="1"/>
+              <w:bottom w:val="single" w:color="E0E0E0" w:sz="1"/>
+              <w:right w:val="single" w:color="E0E0E0" w:sz="1"/>
+            </w:tcBorders>
             <w:tcMar>
               <w:top w:type="dxa" w:w="80"/>
               <w:left w:type="dxa" w:w="120"/>
@@ -3078,24 +2848,26 @@
                 <w:rFonts w:ascii="Arial" w:cs="Arial" w:eastAsia="Arial" w:hAnsi="Arial"/>
                 <w:b/>
                 <w:bCs/>
-                <w:color w:val="FFFFFF"/>
-                <w:sz w:val="20"/>
-                <w:szCs w:val="20"/>
-              </w:rPr>
-              <w:t xml:space="preserve">Sin pago</w:t>
-            </w:r>
-          </w:p>
-        </w:tc>
-        <w:tc>
-          <w:tcPr>
-            <w:tcW w:type="dxa" w:w="3660"/>
-            <w:tcBorders>
-              <w:top w:val="single" w:color="E0E0E0" w:sz="1"/>
-              <w:left w:val="single" w:color="E0E0E0" w:sz="1"/>
-              <w:bottom w:val="single" w:color="E0E0E0" w:sz="1"/>
-              <w:right w:val="single" w:color="E0E0E0" w:sz="1"/>
-            </w:tcBorders>
-            <w:shd w:fill="2E7D32" w:val="clear"/>
+                <w:color w:val="212121"/>
+                <w:sz w:val="20"/>
+                <w:szCs w:val="20"/>
+              </w:rPr>
+              <w:t xml:space="preserve">________________________________________</w:t>
+            </w:r>
+          </w:p>
+        </w:tc>
+      </w:tr>
+      <w:tr>
+        <w:tc>
+          <w:tcPr>
+            <w:tcW w:type="dxa" w:w="3000"/>
+            <w:tcBorders>
+              <w:top w:val="single" w:color="E0E0E0" w:sz="1"/>
+              <w:left w:val="single" w:color="E0E0E0" w:sz="1"/>
+              <w:bottom w:val="single" w:color="E0E0E0" w:sz="1"/>
+              <w:right w:val="single" w:color="E0E0E0" w:sz="1"/>
+            </w:tcBorders>
+            <w:shd w:fill="FFF3E0" w:val="clear"/>
             <w:tcMar>
               <w:top w:type="dxa" w:w="80"/>
               <w:left w:type="dxa" w:w="120"/>
@@ -3109,361 +2881,208 @@
                 <w:rFonts w:ascii="Arial" w:cs="Arial" w:eastAsia="Arial" w:hAnsi="Arial"/>
                 <w:b/>
                 <w:bCs/>
-                <w:color w:val="FFFFFF"/>
-                <w:sz w:val="20"/>
-                <w:szCs w:val="20"/>
-              </w:rPr>
-              <w:t xml:space="preserve">Con pago activo</w:t>
-            </w:r>
-          </w:p>
-        </w:tc>
-      </w:tr>
-      <w:tr>
-        <w:tc>
-          <w:tcPr>
-            <w:tcW w:type="dxa" w:w="2000"/>
-            <w:tcBorders>
-              <w:top w:val="single" w:color="E0E0E0" w:sz="1"/>
-              <w:left w:val="single" w:color="E0E0E0" w:sz="1"/>
-              <w:bottom w:val="single" w:color="E0E0E0" w:sz="1"/>
-              <w:right w:val="single" w:color="E0E0E0" w:sz="1"/>
-            </w:tcBorders>
-            <w:tcMar>
-              <w:top w:type="dxa" w:w="80"/>
-              <w:left w:type="dxa" w:w="120"/>
-              <w:bottom w:type="dxa" w:w="80"/>
-              <w:right w:type="dxa" w:w="120"/>
-            </w:tcMar>
-          </w:tcPr>
-          <w:p>
-            <w:r>
-              <w:rPr>
-                <w:rFonts w:ascii="Arial" w:cs="Arial" w:eastAsia="Arial" w:hAnsi="Arial"/>
-                <w:color w:val="212121"/>
-                <w:sz w:val="20"/>
-                <w:szCs w:val="20"/>
-              </w:rPr>
-              <w:t xml:space="preserve">Meta</w:t>
-            </w:r>
-          </w:p>
-        </w:tc>
-        <w:tc>
-          <w:tcPr>
-            <w:tcW w:type="dxa" w:w="3700"/>
-            <w:tcBorders>
-              <w:top w:val="single" w:color="E0E0E0" w:sz="1"/>
-              <w:left w:val="single" w:color="E0E0E0" w:sz="1"/>
-              <w:bottom w:val="single" w:color="E0E0E0" w:sz="1"/>
-              <w:right w:val="single" w:color="E0E0E0" w:sz="1"/>
-            </w:tcBorders>
-            <w:tcMar>
-              <w:top w:type="dxa" w:w="80"/>
-              <w:left w:type="dxa" w:w="120"/>
-              <w:bottom w:type="dxa" w:w="80"/>
-              <w:right w:type="dxa" w:w="120"/>
-            </w:tcMar>
-          </w:tcPr>
-          <w:p>
-            <w:r>
-              <w:rPr>
-                <w:rFonts w:ascii="Arial" w:cs="Arial" w:eastAsia="Arial" w:hAnsi="Arial"/>
-                <w:color w:val="212121"/>
-                <w:sz w:val="20"/>
-                <w:szCs w:val="20"/>
-              </w:rPr>
-              <w:t xml:space="preserve">El asistente responde hasta agotar las 1.000 conversaciones gratuitas del mes; los seguimientos y avisos con plantilla no salen</w:t>
-            </w:r>
-          </w:p>
-        </w:tc>
-        <w:tc>
-          <w:tcPr>
-            <w:tcW w:type="dxa" w:w="3660"/>
-            <w:tcBorders>
-              <w:top w:val="single" w:color="E0E0E0" w:sz="1"/>
-              <w:left w:val="single" w:color="E0E0E0" w:sz="1"/>
-              <w:bottom w:val="single" w:color="E0E0E0" w:sz="1"/>
-              <w:right w:val="single" w:color="E0E0E0" w:sz="1"/>
-            </w:tcBorders>
-            <w:tcMar>
-              <w:top w:type="dxa" w:w="80"/>
-              <w:left w:type="dxa" w:w="120"/>
-              <w:bottom w:type="dxa" w:w="80"/>
-              <w:right w:type="dxa" w:w="120"/>
-            </w:tcMar>
-          </w:tcPr>
-          <w:p>
-            <w:r>
-              <w:rPr>
-                <w:rFonts w:ascii="Arial" w:cs="Arial" w:eastAsia="Arial" w:hAnsi="Arial"/>
-                <w:color w:val="212121"/>
-                <w:sz w:val="20"/>
-                <w:szCs w:val="20"/>
-              </w:rPr>
-              <w:t xml:space="preserve">Todo opera; los cobros se ven en WhatsApp Manager → Configuración de pagos</w:t>
-            </w:r>
-          </w:p>
-        </w:tc>
-      </w:tr>
-      <w:tr>
-        <w:tc>
-          <w:tcPr>
-            <w:tcW w:type="dxa" w:w="2000"/>
-            <w:tcBorders>
-              <w:top w:val="single" w:color="E0E0E0" w:sz="1"/>
-              <w:left w:val="single" w:color="E0E0E0" w:sz="1"/>
-              <w:bottom w:val="single" w:color="E0E0E0" w:sz="1"/>
-              <w:right w:val="single" w:color="E0E0E0" w:sz="1"/>
-            </w:tcBorders>
-            <w:tcMar>
-              <w:top w:type="dxa" w:w="80"/>
-              <w:left w:type="dxa" w:w="120"/>
-              <w:bottom w:type="dxa" w:w="80"/>
-              <w:right w:type="dxa" w:w="120"/>
-            </w:tcMar>
-          </w:tcPr>
-          <w:p>
-            <w:r>
-              <w:rPr>
-                <w:rFonts w:ascii="Arial" w:cs="Arial" w:eastAsia="Arial" w:hAnsi="Arial"/>
-                <w:color w:val="212121"/>
-                <w:sz w:val="20"/>
-                <w:szCs w:val="20"/>
-              </w:rPr>
-              <w:t xml:space="preserve">Google Cloud (Gemini)</w:t>
-            </w:r>
-          </w:p>
-        </w:tc>
-        <w:tc>
-          <w:tcPr>
-            <w:tcW w:type="dxa" w:w="3700"/>
-            <w:tcBorders>
-              <w:top w:val="single" w:color="E0E0E0" w:sz="1"/>
-              <w:left w:val="single" w:color="E0E0E0" w:sz="1"/>
-              <w:bottom w:val="single" w:color="E0E0E0" w:sz="1"/>
-              <w:right w:val="single" w:color="E0E0E0" w:sz="1"/>
-            </w:tcBorders>
-            <w:tcMar>
-              <w:top w:type="dxa" w:w="80"/>
-              <w:left w:type="dxa" w:w="120"/>
-              <w:bottom w:type="dxa" w:w="80"/>
-              <w:right w:type="dxa" w:w="120"/>
-            </w:tcMar>
-          </w:tcPr>
-          <w:p>
-            <w:r>
-              <w:rPr>
-                <w:rFonts w:ascii="Arial" w:cs="Arial" w:eastAsia="Arial" w:hAnsi="Arial"/>
-                <w:color w:val="212121"/>
-                <w:sz w:val="20"/>
-                <w:szCs w:val="20"/>
-              </w:rPr>
-              <w:t xml:space="preserve">El asistente no responde a los clientes</w:t>
-            </w:r>
-          </w:p>
-        </w:tc>
-        <w:tc>
-          <w:tcPr>
-            <w:tcW w:type="dxa" w:w="3660"/>
-            <w:tcBorders>
-              <w:top w:val="single" w:color="E0E0E0" w:sz="1"/>
-              <w:left w:val="single" w:color="E0E0E0" w:sz="1"/>
-              <w:bottom w:val="single" w:color="E0E0E0" w:sz="1"/>
-              <w:right w:val="single" w:color="E0E0E0" w:sz="1"/>
-            </w:tcBorders>
-            <w:tcMar>
-              <w:top w:type="dxa" w:w="80"/>
-              <w:left w:type="dxa" w:w="120"/>
-              <w:bottom w:type="dxa" w:w="80"/>
-              <w:right w:type="dxa" w:w="120"/>
-            </w:tcMar>
-          </w:tcPr>
-          <w:p>
-            <w:r>
-              <w:rPr>
-                <w:rFonts w:ascii="Arial" w:cs="Arial" w:eastAsia="Arial" w:hAnsi="Arial"/>
-                <w:color w:val="212121"/>
-                <w:sz w:val="20"/>
-                <w:szCs w:val="20"/>
-              </w:rPr>
-              <w:t xml:space="preserve">Responde normal</w:t>
-            </w:r>
-          </w:p>
-        </w:tc>
-      </w:tr>
-      <w:tr>
-        <w:tc>
-          <w:tcPr>
-            <w:tcW w:type="dxa" w:w="2000"/>
-            <w:tcBorders>
-              <w:top w:val="single" w:color="E0E0E0" w:sz="1"/>
-              <w:left w:val="single" w:color="E0E0E0" w:sz="1"/>
-              <w:bottom w:val="single" w:color="E0E0E0" w:sz="1"/>
-              <w:right w:val="single" w:color="E0E0E0" w:sz="1"/>
-            </w:tcBorders>
-            <w:tcMar>
-              <w:top w:type="dxa" w:w="80"/>
-              <w:left w:type="dxa" w:w="120"/>
-              <w:bottom w:type="dxa" w:w="80"/>
-              <w:right w:type="dxa" w:w="120"/>
-            </w:tcMar>
-          </w:tcPr>
-          <w:p>
-            <w:r>
-              <w:rPr>
-                <w:rFonts w:ascii="Arial" w:cs="Arial" w:eastAsia="Arial" w:hAnsi="Arial"/>
-                <w:color w:val="212121"/>
-                <w:sz w:val="20"/>
-                <w:szCs w:val="20"/>
-              </w:rPr>
-              <w:t xml:space="preserve">OpenAI</w:t>
-            </w:r>
-          </w:p>
-        </w:tc>
-        <w:tc>
-          <w:tcPr>
-            <w:tcW w:type="dxa" w:w="3700"/>
-            <w:tcBorders>
-              <w:top w:val="single" w:color="E0E0E0" w:sz="1"/>
-              <w:left w:val="single" w:color="E0E0E0" w:sz="1"/>
-              <w:bottom w:val="single" w:color="E0E0E0" w:sz="1"/>
-              <w:right w:val="single" w:color="E0E0E0" w:sz="1"/>
-            </w:tcBorders>
-            <w:tcMar>
-              <w:top w:type="dxa" w:w="80"/>
-              <w:left w:type="dxa" w:w="120"/>
-              <w:bottom w:type="dxa" w:w="80"/>
-              <w:right w:type="dxa" w:w="120"/>
-            </w:tcMar>
-          </w:tcPr>
-          <w:p>
-            <w:r>
-              <w:rPr>
-                <w:rFonts w:ascii="Arial" w:cs="Arial" w:eastAsia="Arial" w:hAnsi="Arial"/>
-                <w:color w:val="212121"/>
-                <w:sz w:val="20"/>
-                <w:szCs w:val="20"/>
-              </w:rPr>
-              <w:t xml:space="preserve">Los audios no se transcriben; el asistente pide el mensaje por escrito</w:t>
-            </w:r>
-          </w:p>
-        </w:tc>
-        <w:tc>
-          <w:tcPr>
-            <w:tcW w:type="dxa" w:w="3660"/>
-            <w:tcBorders>
-              <w:top w:val="single" w:color="E0E0E0" w:sz="1"/>
-              <w:left w:val="single" w:color="E0E0E0" w:sz="1"/>
-              <w:bottom w:val="single" w:color="E0E0E0" w:sz="1"/>
-              <w:right w:val="single" w:color="E0E0E0" w:sz="1"/>
-            </w:tcBorders>
-            <w:tcMar>
-              <w:top w:type="dxa" w:w="80"/>
-              <w:left w:type="dxa" w:w="120"/>
-              <w:bottom w:type="dxa" w:w="80"/>
-              <w:right w:type="dxa" w:w="120"/>
-            </w:tcMar>
-          </w:tcPr>
-          <w:p>
-            <w:r>
-              <w:rPr>
-                <w:rFonts w:ascii="Arial" w:cs="Arial" w:eastAsia="Arial" w:hAnsi="Arial"/>
-                <w:color w:val="212121"/>
-                <w:sz w:val="20"/>
-                <w:szCs w:val="20"/>
-              </w:rPr>
-              <w:t xml:space="preserve">Los audios se entienden</w:t>
-            </w:r>
-          </w:p>
-        </w:tc>
-      </w:tr>
-      <w:tr>
-        <w:tc>
-          <w:tcPr>
-            <w:tcW w:type="dxa" w:w="2000"/>
-            <w:tcBorders>
-              <w:top w:val="single" w:color="E0E0E0" w:sz="1"/>
-              <w:left w:val="single" w:color="E0E0E0" w:sz="1"/>
-              <w:bottom w:val="single" w:color="E0E0E0" w:sz="1"/>
-              <w:right w:val="single" w:color="E0E0E0" w:sz="1"/>
-            </w:tcBorders>
-            <w:tcMar>
-              <w:top w:type="dxa" w:w="80"/>
-              <w:left w:type="dxa" w:w="120"/>
-              <w:bottom w:type="dxa" w:w="80"/>
-              <w:right w:type="dxa" w:w="120"/>
-            </w:tcMar>
-          </w:tcPr>
-          <w:p>
-            <w:r>
-              <w:rPr>
-                <w:rFonts w:ascii="Arial" w:cs="Arial" w:eastAsia="Arial" w:hAnsi="Arial"/>
-                <w:color w:val="212121"/>
-                <w:sz w:val="20"/>
-                <w:szCs w:val="20"/>
-              </w:rPr>
-              <w:t xml:space="preserve">Hetzner</w:t>
-            </w:r>
-          </w:p>
-        </w:tc>
-        <w:tc>
-          <w:tcPr>
-            <w:tcW w:type="dxa" w:w="3700"/>
-            <w:tcBorders>
-              <w:top w:val="single" w:color="E0E0E0" w:sz="1"/>
-              <w:left w:val="single" w:color="E0E0E0" w:sz="1"/>
-              <w:bottom w:val="single" w:color="E0E0E0" w:sz="1"/>
-              <w:right w:val="single" w:color="E0E0E0" w:sz="1"/>
-            </w:tcBorders>
-            <w:tcMar>
-              <w:top w:type="dxa" w:w="80"/>
-              <w:left w:type="dxa" w:w="120"/>
-              <w:bottom w:type="dxa" w:w="80"/>
-              <w:right w:type="dxa" w:w="120"/>
-            </w:tcMar>
-          </w:tcPr>
-          <w:p>
-            <w:r>
-              <w:rPr>
-                <w:rFonts w:ascii="Arial" w:cs="Arial" w:eastAsia="Arial" w:hAnsi="Arial"/>
-                <w:color w:val="212121"/>
-                <w:sz w:val="20"/>
-                <w:szCs w:val="20"/>
-              </w:rPr>
-              <w:t xml:space="preserve">Nada cambia mientras esté en la cuenta de raaamp</w:t>
-            </w:r>
-          </w:p>
-        </w:tc>
-        <w:tc>
-          <w:tcPr>
-            <w:tcW w:type="dxa" w:w="3660"/>
-            <w:tcBorders>
-              <w:top w:val="single" w:color="E0E0E0" w:sz="1"/>
-              <w:left w:val="single" w:color="E0E0E0" w:sz="1"/>
-              <w:bottom w:val="single" w:color="E0E0E0" w:sz="1"/>
-              <w:right w:val="single" w:color="E0E0E0" w:sz="1"/>
-            </w:tcBorders>
-            <w:tcMar>
-              <w:top w:type="dxa" w:w="80"/>
-              <w:left w:type="dxa" w:w="120"/>
-              <w:bottom w:type="dxa" w:w="80"/>
-              <w:right w:type="dxa" w:w="120"/>
-            </w:tcMar>
-          </w:tcPr>
-          <w:p>
-            <w:r>
-              <w:rPr>
-                <w:rFonts w:ascii="Arial" w:cs="Arial" w:eastAsia="Arial" w:hAnsi="Arial"/>
-                <w:color w:val="212121"/>
-                <w:sz w:val="20"/>
-                <w:szCs w:val="20"/>
-              </w:rPr>
-              <w:t xml:space="preserve">La factura llega a la empresa</w:t>
+                <w:color w:val="212121"/>
+                <w:sz w:val="20"/>
+                <w:szCs w:val="20"/>
+              </w:rPr>
+              <w:t xml:space="preserve">Contraseña</w:t>
+            </w:r>
+          </w:p>
+        </w:tc>
+        <w:tc>
+          <w:tcPr>
+            <w:tcW w:type="dxa" w:w="6360"/>
+            <w:tcBorders>
+              <w:top w:val="single" w:color="E0E0E0" w:sz="1"/>
+              <w:left w:val="single" w:color="E0E0E0" w:sz="1"/>
+              <w:bottom w:val="single" w:color="E0E0E0" w:sz="1"/>
+              <w:right w:val="single" w:color="E0E0E0" w:sz="1"/>
+            </w:tcBorders>
+            <w:tcMar>
+              <w:top w:type="dxa" w:w="80"/>
+              <w:left w:type="dxa" w:w="120"/>
+              <w:bottom w:type="dxa" w:w="80"/>
+              <w:right w:type="dxa" w:w="120"/>
+            </w:tcMar>
+          </w:tcPr>
+          <w:p>
+            <w:r>
+              <w:rPr>
+                <w:rFonts w:ascii="Arial" w:cs="Arial" w:eastAsia="Arial" w:hAnsi="Arial"/>
+                <w:b/>
+                <w:bCs/>
+                <w:color w:val="212121"/>
+                <w:sz w:val="20"/>
+                <w:szCs w:val="20"/>
+              </w:rPr>
+              <w:t xml:space="preserve">________________________________________</w:t>
             </w:r>
           </w:p>
         </w:tc>
       </w:tr>
     </w:tbl>
     <w:p>
+      <w:pPr>
+        <w:spacing w:after="0" w:before="80"/>
+      </w:pPr>
+    </w:p>
+    <w:p>
+      <w:pPr>
+        <w:pStyle w:val="ListParagraph"/>
+        <w:numPr>
+          <w:ilvl w:val="0"/>
+          <w:numId w:val="5"/>
+        </w:numPr>
+        <w:spacing w:after="60"/>
+      </w:pPr>
+      <w:r>
+        <w:rPr>
+          <w:rFonts w:ascii="Arial" w:cs="Arial" w:eastAsia="Arial" w:hAnsi="Arial"/>
+          <w:color w:val="212121"/>
+          <w:sz w:val="20"/>
+          <w:szCs w:val="20"/>
+        </w:rPr>
+        <w:t xml:space="preserve">Entre a </w:t>
+      </w:r>
+      <w:r>
+        <w:rPr>
+          <w:rFonts w:ascii="Arial" w:cs="Arial" w:eastAsia="Arial" w:hAnsi="Arial"/>
+          <w:b/>
+          <w:bCs/>
+          <w:color w:val="212121"/>
+          <w:sz w:val="20"/>
+          <w:szCs w:val="20"/>
+        </w:rPr>
+        <w:t xml:space="preserve">accounts.hetzner.com</w:t>
+      </w:r>
+      <w:r>
+        <w:rPr>
+          <w:rFonts w:ascii="Arial" w:cs="Arial" w:eastAsia="Arial" w:hAnsi="Arial"/>
+          <w:color w:val="212121"/>
+          <w:sz w:val="20"/>
+          <w:szCs w:val="20"/>
+        </w:rPr>
+        <w:t xml:space="preserve"> con el usuario y la contraseña de arriba.</w:t>
+      </w:r>
+    </w:p>
+    <w:p>
+      <w:pPr>
+        <w:pStyle w:val="ListParagraph"/>
+        <w:numPr>
+          <w:ilvl w:val="0"/>
+          <w:numId w:val="5"/>
+        </w:numPr>
+        <w:spacing w:after="60"/>
+      </w:pPr>
+      <w:r>
+        <w:rPr>
+          <w:rFonts w:ascii="Arial" w:cs="Arial" w:eastAsia="Arial" w:hAnsi="Arial"/>
+          <w:color w:val="212121"/>
+          <w:sz w:val="20"/>
+          <w:szCs w:val="20"/>
+        </w:rPr>
+        <w:t xml:space="preserve">Abra </w:t>
+      </w:r>
+      <w:r>
+        <w:rPr>
+          <w:rFonts w:ascii="Arial" w:cs="Arial" w:eastAsia="Arial" w:hAnsi="Arial"/>
+          <w:b/>
+          <w:bCs/>
+          <w:color w:val="212121"/>
+          <w:sz w:val="20"/>
+          <w:szCs w:val="20"/>
+        </w:rPr>
+        <w:t xml:space="preserve">Payment methods</w:t>
+      </w:r>
+      <w:r>
+        <w:rPr>
+          <w:rFonts w:ascii="Arial" w:cs="Arial" w:eastAsia="Arial" w:hAnsi="Arial"/>
+          <w:color w:val="212121"/>
+          <w:sz w:val="20"/>
+          <w:szCs w:val="20"/>
+        </w:rPr>
+        <w:t xml:space="preserve"> (Métodos de pago) y haga clic en </w:t>
+      </w:r>
+      <w:r>
+        <w:rPr>
+          <w:rFonts w:ascii="Arial" w:cs="Arial" w:eastAsia="Arial" w:hAnsi="Arial"/>
+          <w:b/>
+          <w:bCs/>
+          <w:color w:val="212121"/>
+          <w:sz w:val="20"/>
+          <w:szCs w:val="20"/>
+        </w:rPr>
+        <w:t xml:space="preserve">Add payment method</w:t>
+      </w:r>
+      <w:r>
+        <w:rPr>
+          <w:rFonts w:ascii="Arial" w:cs="Arial" w:eastAsia="Arial" w:hAnsi="Arial"/>
+          <w:color w:val="212121"/>
+          <w:sz w:val="20"/>
+          <w:szCs w:val="20"/>
+        </w:rPr>
+        <w:t xml:space="preserve"> para agregar el método de pago de la empresa.</w:t>
+      </w:r>
+    </w:p>
+    <w:p>
+      <w:pPr>
+        <w:pStyle w:val="ListParagraph"/>
+        <w:numPr>
+          <w:ilvl w:val="0"/>
+          <w:numId w:val="5"/>
+        </w:numPr>
+        <w:spacing w:after="60"/>
+      </w:pPr>
+      <w:r>
+        <w:rPr>
+          <w:rFonts w:ascii="Arial" w:cs="Arial" w:eastAsia="Arial" w:hAnsi="Arial"/>
+          <w:color w:val="212121"/>
+          <w:sz w:val="20"/>
+          <w:szCs w:val="20"/>
+        </w:rPr>
+        <w:t xml:space="preserve">Marque el nuevo método como </w:t>
+      </w:r>
+      <w:r>
+        <w:rPr>
+          <w:rFonts w:ascii="Arial" w:cs="Arial" w:eastAsia="Arial" w:hAnsi="Arial"/>
+          <w:b/>
+          <w:bCs/>
+          <w:color w:val="212121"/>
+          <w:sz w:val="20"/>
+          <w:szCs w:val="20"/>
+        </w:rPr>
+        <w:t xml:space="preserve">predeterminado</w:t>
+      </w:r>
+      <w:r>
+        <w:rPr>
+          <w:rFonts w:ascii="Arial" w:cs="Arial" w:eastAsia="Arial" w:hAnsi="Arial"/>
+          <w:color w:val="212121"/>
+          <w:sz w:val="20"/>
+          <w:szCs w:val="20"/>
+        </w:rPr>
+        <w:t xml:space="preserve"> y elimine la tarjeta anterior (la de raaamp).</w:t>
+      </w:r>
+    </w:p>
+    <w:p>
+      <w:pPr>
+        <w:pStyle w:val="ListParagraph"/>
+        <w:numPr>
+          <w:ilvl w:val="0"/>
+          <w:numId w:val="5"/>
+        </w:numPr>
+        <w:spacing w:after="60"/>
+      </w:pPr>
+      <w:r>
+        <w:rPr>
+          <w:rFonts w:ascii="Arial" w:cs="Arial" w:eastAsia="Arial" w:hAnsi="Arial"/>
+          <w:color w:val="212121"/>
+          <w:sz w:val="20"/>
+          <w:szCs w:val="20"/>
+        </w:rPr>
+        <w:t xml:space="preserve">Desde ese momento la factura mensual de Hetzner se cobra al método de pago de la empresa.</w:t>
+      </w:r>
+    </w:p>
+    <w:p>
       <w:r>
         <w:br w:type="page"/>
       </w:r>
@@ -3473,7 +3092,7 @@
         <w:pStyle w:val="Heading1"/>
       </w:pPr>
       <w:r>
-        <w:t xml:space="preserve">5. Cambio de la línea de WhatsApp del asistente</w:t>
+        <w:t xml:space="preserve">4. Cambio de la línea de WhatsApp del asistente</w:t>
       </w:r>
     </w:p>
     <w:tbl>
@@ -3823,7 +3442,7 @@
                 <w:sz w:val="20"/>
                 <w:szCs w:val="20"/>
               </w:rPr>
-              <w:t xml:space="preserve">Línea desde la que atenderá el asistente una vez De Paseo en Fincas dé el OK</w:t>
+              <w:t xml:space="preserve">Línea desde la que atenderá el asistente una vez se haga el cambio</w:t>
             </w:r>
           </w:p>
         </w:tc>
@@ -3858,7 +3477,7 @@
           <w:sz w:val="20"/>
           <w:szCs w:val="20"/>
         </w:rPr>
-        <w:t xml:space="preserve">De Paseo en Fincas confirma por escrito a raaamp el OK para hacer el cambio y la fecha en que quiere que ocurra.</w:t>
+        <w:t xml:space="preserve">El cambio se realiza cuando De Paseo en Fincas confirme la fecha. Toma unas horas y no requiere nada del lado de la empresa.</w:t>
       </w:r>
     </w:p>
     <w:p>
@@ -3877,7 +3496,7 @@
           <w:sz w:val="20"/>
           <w:szCs w:val="20"/>
         </w:rPr>
-        <w:t xml:space="preserve">raaamp conecta el asistente a la línea +57 310 5639334, revisa las plantillas de mensajes y hace las pruebas completas. El cambio toma unas horas y no requiere nada del lado de De Paseo en Fincas.</w:t>
+        <w:t xml:space="preserve">Una vez hecho el cambio, De Paseo en Fincas publica el número +57 310 5639334 en su página, redes e Instagram como línea de atención.</w:t>
       </w:r>
     </w:p>
     <w:p>
@@ -3896,26 +3515,7 @@
           <w:sz w:val="20"/>
           <w:szCs w:val="20"/>
         </w:rPr>
-        <w:t xml:space="preserve">raaamp confirma por escrito que el asistente ya responde desde +57 310 5639334.</w:t>
-      </w:r>
-    </w:p>
-    <w:p>
-      <w:pPr>
-        <w:pStyle w:val="ListParagraph"/>
-        <w:numPr>
-          <w:ilvl w:val="0"/>
-          <w:numId w:val="6"/>
-        </w:numPr>
-        <w:spacing w:after="60"/>
-      </w:pPr>
-      <w:r>
-        <w:rPr>
-          <w:rFonts w:ascii="Arial" w:cs="Arial" w:eastAsia="Arial" w:hAnsi="Arial"/>
-          <w:color w:val="212121"/>
-          <w:sz w:val="20"/>
-          <w:szCs w:val="20"/>
-        </w:rPr>
-        <w:t xml:space="preserve">A partir de ese momento De Paseo en Fincas publica el número +57 310 5639334 en su página, redes e Instagram como línea de atención. La línea +1 201-701-8810 se mantiene respondiendo unas semanas más para los clientes que la tengan guardada, y luego se retira.</w:t>
+        <w:t xml:space="preserve">La línea +1 201-701-8810 se mantiene respondiendo unas semanas más para los clientes que la tengan guardada, y luego se retira.</w:t>
       </w:r>
     </w:p>
     <w:p>
@@ -4023,7 +3623,7 @@
           <w:sz w:val="20"/>
           <w:szCs w:val="20"/>
         </w:rPr>
-        <w:t xml:space="preserve">Método de pago agregado en la cuenta de Hetzner y aviso enviado a raaamp.</w:t>
+        <w:t xml:space="preserve">Método de pago de Hetzner reemplazado por el de la empresa.</w:t>
       </w:r>
     </w:p>
     <w:p>
@@ -4043,44 +3643,6 @@
           <w:szCs w:val="20"/>
         </w:rPr>
         <w:t xml:space="preserve">Verificación en dos pasos activa en la cuenta de Google.</w:t>
-      </w:r>
-    </w:p>
-    <w:p>
-      <w:pPr>
-        <w:pStyle w:val="ListParagraph"/>
-        <w:numPr>
-          <w:ilvl w:val="0"/>
-          <w:numId w:val="7"/>
-        </w:numPr>
-        <w:spacing w:after="60"/>
-      </w:pPr>
-      <w:r>
-        <w:rPr>
-          <w:rFonts w:ascii="Arial" w:cs="Arial" w:eastAsia="Arial" w:hAnsi="Arial"/>
-          <w:color w:val="212121"/>
-          <w:sz w:val="20"/>
-          <w:szCs w:val="20"/>
-        </w:rPr>
-        <w:t xml:space="preserve">OK por escrito a raaamp para pasar el asistente a la línea +57 310 5639334.</w:t>
-      </w:r>
-    </w:p>
-    <w:p>
-      <w:pPr>
-        <w:pStyle w:val="ListParagraph"/>
-        <w:numPr>
-          <w:ilvl w:val="0"/>
-          <w:numId w:val="7"/>
-        </w:numPr>
-        <w:spacing w:after="60"/>
-      </w:pPr>
-      <w:r>
-        <w:rPr>
-          <w:rFonts w:ascii="Arial" w:cs="Arial" w:eastAsia="Arial" w:hAnsi="Arial"/>
-          <w:color w:val="212121"/>
-          <w:sz w:val="20"/>
-          <w:szCs w:val="20"/>
-        </w:rPr>
-        <w:t xml:space="preserve">raaamp confirmó por escrito que el asistente responde, entiende audios y envía seguimientos.</w:t>
       </w:r>
     </w:p>
     <w:sectPr>

</xml_diff>

<commit_message>
docs(guía cliente): cambio de línea sin transición de la +1 ni decisiones a cargo del cliente
</commit_message>
<xml_diff>
--- a/docs/Guia_Metodos_de_Pago_DePaseoEnFincas.docx
+++ b/docs/Guia_Metodos_de_Pago_DePaseoEnFincas.docx
@@ -3477,7 +3477,7 @@
           <w:sz w:val="20"/>
           <w:szCs w:val="20"/>
         </w:rPr>
-        <w:t xml:space="preserve">El cambio se realiza cuando De Paseo en Fincas confirme la fecha. Toma unas horas y no requiere nada del lado de la empresa.</w:t>
+        <w:t xml:space="preserve">El cambio técnico toma unas horas y no requiere nada del lado de De Paseo en Fincas.</w:t>
       </w:r>
     </w:p>
     <w:p>
@@ -3496,7 +3496,7 @@
           <w:sz w:val="20"/>
           <w:szCs w:val="20"/>
         </w:rPr>
-        <w:t xml:space="preserve">Una vez hecho el cambio, De Paseo en Fincas publica el número +57 310 5639334 en su página, redes e Instagram como línea de atención.</w:t>
+        <w:t xml:space="preserve">Desde ese momento el asistente atiende únicamente desde +57 310 5639334.</w:t>
       </w:r>
     </w:p>
     <w:p>
@@ -3515,7 +3515,7 @@
           <w:sz w:val="20"/>
           <w:szCs w:val="20"/>
         </w:rPr>
-        <w:t xml:space="preserve">La línea +1 201-701-8810 se mantiene respondiendo unas semanas más para los clientes que la tengan guardada, y luego se retira.</w:t>
+        <w:t xml:space="preserve">Una vez hecho el cambio, De Paseo en Fincas publica el número +57 310 5639334 en su página, redes e Instagram como línea de atención.</w:t>
       </w:r>
     </w:p>
     <w:p>

</xml_diff>